<commit_message>
agregar archivos de renuncia
</commit_message>
<xml_diff>
--- a/Renuncia/Carta de renuncia_2026.docx
+++ b/Renuncia/Carta de renuncia_2026.docx
@@ -1,6 +1,6 @@
 
 <file path=word/document.xml><?xml version="1.0" encoding="utf-8"?>
-<w:document xmlns:wpc="http://schemas.microsoft.com/office/word/2010/wordprocessingCanvas" xmlns:cx="http://schemas.microsoft.com/office/drawing/2014/chartex" xmlns:cx1="http://schemas.microsoft.com/office/drawing/2015/9/8/chartex" xmlns:cx2="http://schemas.microsoft.com/office/drawing/2015/10/21/chartex" xmlns:cx3="http://schemas.microsoft.com/office/drawing/2016/5/9/chartex" xmlns:cx4="http://schemas.microsoft.com/office/drawing/2016/5/10/chartex" xmlns:cx5="http://schemas.microsoft.com/office/drawing/2016/5/11/chartex" xmlns:cx6="http://schemas.microsoft.com/office/drawing/2016/5/12/chartex" xmlns:cx7="http://schemas.microsoft.com/office/drawing/2016/5/13/chartex" xmlns:cx8="http://schemas.microsoft.com/office/drawing/2016/5/14/chartex" xmlns:mc="http://schemas.openxmlformats.org/markup-compatibility/2006" xmlns:aink="http://schemas.microsoft.com/office/drawing/2016/ink" xmlns:am3d="http://schemas.microsoft.com/office/drawing/2017/model3d" xmlns:o="urn:schemas-microsoft-com:office:office" xmlns:oel="http://schemas.microsoft.com/office/2019/extlst" xmlns:r="http://schemas.openxmlformats.org/officeDocument/2006/relationships" xmlns:m="http://schemas.openxmlformats.org/officeDocument/2006/math" xmlns:v="urn:schemas-microsoft-com:vml" xmlns:wp14="http://schemas.microsoft.com/office/word/2010/wordprocessingDrawing" xmlns:wp="http://schemas.openxmlformats.org/drawingml/2006/wordprocessingDrawing" xmlns:w10="urn:schemas-microsoft-com:office:word" xmlns:w="http://schemas.openxmlformats.org/wordprocessingml/2006/main" xmlns:w14="http://schemas.microsoft.com/office/word/2010/wordml" xmlns:w15="http://schemas.microsoft.com/office/word/2012/wordml" xmlns:w16cex="http://schemas.microsoft.com/office/word/2018/wordml/cex" xmlns:w16cid="http://schemas.microsoft.com/office/word/2016/wordml/cid" xmlns:w16="http://schemas.microsoft.com/office/word/2018/wordml" xmlns:w16du="http://schemas.microsoft.com/office/word/2023/wordml/word16du" xmlns:w16sdtdh="http://schemas.microsoft.com/office/word/2020/wordml/sdtdatahash" xmlns:w16sdtfl="http://schemas.microsoft.com/office/word/2024/wordml/sdtformatlock" xmlns:w16se="http://schemas.microsoft.com/office/word/2015/wordml/symex" xmlns:wpg="http://schemas.microsoft.com/office/word/2010/wordprocessingGroup" xmlns:wpi="http://schemas.microsoft.com/office/word/2010/wordprocessingInk" xmlns:wne="http://schemas.microsoft.com/office/word/2006/wordml" xmlns:wps="http://schemas.microsoft.com/office/word/2010/wordprocessingShape" mc:Ignorable="w14 w15 w16se w16cid w16 w16cex w16sdtdh w16sdtfl w16du wp14">
+<w:document xmlns:wpc="http://schemas.microsoft.com/office/word/2010/wordprocessingCanvas" xmlns:cx="http://schemas.microsoft.com/office/drawing/2014/chartex" xmlns:cx1="http://schemas.microsoft.com/office/drawing/2015/9/8/chartex" xmlns:cx2="http://schemas.microsoft.com/office/drawing/2015/10/21/chartex" xmlns:cx3="http://schemas.microsoft.com/office/drawing/2016/5/9/chartex" xmlns:cx4="http://schemas.microsoft.com/office/drawing/2016/5/10/chartex" xmlns:cx5="http://schemas.microsoft.com/office/drawing/2016/5/11/chartex" xmlns:cx6="http://schemas.microsoft.com/office/drawing/2016/5/12/chartex" xmlns:cx7="http://schemas.microsoft.com/office/drawing/2016/5/13/chartex" xmlns:cx8="http://schemas.microsoft.com/office/drawing/2016/5/14/chartex" xmlns:mc="http://schemas.openxmlformats.org/markup-compatibility/2006" xmlns:aink="http://schemas.microsoft.com/office/drawing/2016/ink" xmlns:am3d="http://schemas.microsoft.com/office/drawing/2017/model3d" xmlns:o="urn:schemas-microsoft-com:office:office" xmlns:oel="http://schemas.microsoft.com/office/2019/extlst" xmlns:r="http://schemas.openxmlformats.org/officeDocument/2006/relationships" xmlns:m="http://schemas.openxmlformats.org/officeDocument/2006/math" xmlns:v="urn:schemas-microsoft-com:vml" xmlns:wp14="http://schemas.microsoft.com/office/word/2010/wordprocessingDrawing" xmlns:wp="http://schemas.openxmlformats.org/drawingml/2006/wordprocessingDrawing" xmlns:w10="urn:schemas-microsoft-com:office:word" xmlns:w="http://schemas.openxmlformats.org/wordprocessingml/2006/main" xmlns:w14="http://schemas.microsoft.com/office/word/2010/wordml" xmlns:w15="http://schemas.microsoft.com/office/word/2012/wordml" xmlns:w16cei="http://schemas.microsoft.com/office/word/2026/wordml/cei" xmlns:w16cex="http://schemas.microsoft.com/office/word/2018/wordml/cex" xmlns:w16cid="http://schemas.microsoft.com/office/word/2016/wordml/cid" xmlns:w16="http://schemas.microsoft.com/office/word/2018/wordml" xmlns:w16du="http://schemas.microsoft.com/office/word/2023/wordml/word16du" xmlns:w16sdtdh="http://schemas.microsoft.com/office/word/2020/wordml/sdtdatahash" xmlns:w16sdtfl="http://schemas.microsoft.com/office/word/2024/wordml/sdtformatlock" xmlns:w16se="http://schemas.microsoft.com/office/word/2015/wordml/symex" xmlns:wpg="http://schemas.microsoft.com/office/word/2010/wordprocessingGroup" xmlns:wpi="http://schemas.microsoft.com/office/word/2010/wordprocessingInk" xmlns:wne="http://schemas.microsoft.com/office/word/2006/wordml" xmlns:wps="http://schemas.microsoft.com/office/word/2010/wordprocessingShape" mc:Ignorable="w14 w15 w16se w16cid w16 w16cex w16sdtdh w16sdtfl w16du wp14">
   <w:body>
     <w:p>
       <w:pPr>
@@ -72,7 +72,6 @@
           <w:szCs w:val="20"/>
         </w:rPr>
         <w:tab/>
-        <w:t>xxxxxxxxx</w:t>
       </w:r>
       <w:r>
         <w:rPr>
@@ -81,7 +80,25 @@
           <w:sz w:val="20"/>
           <w:szCs w:val="20"/>
         </w:rPr>
-        <w:tab/>
+        <w:t>Pedro Daniel</w:t>
+      </w:r>
+      <w:r>
+        <w:rPr>
+          <w:rFonts w:ascii="Arial" w:hAnsi="Arial" w:cs="Arial"/>
+          <w:b/>
+          <w:sz w:val="20"/>
+          <w:szCs w:val="20"/>
+        </w:rPr>
+        <w:t xml:space="preserve"> </w:t>
+      </w:r>
+      <w:r>
+        <w:rPr>
+          <w:rFonts w:ascii="Arial" w:hAnsi="Arial" w:cs="Arial"/>
+          <w:b/>
+          <w:sz w:val="20"/>
+          <w:szCs w:val="20"/>
+        </w:rPr>
+        <w:t>Davila Jacome</w:t>
       </w:r>
     </w:p>
     <w:p>
@@ -117,7 +134,7 @@
           <w:szCs w:val="20"/>
         </w:rPr>
         <w:tab/>
-        <w:t>DIRECTOR/A NACIONAL DE TALENTO HUMANO</w:t>
+        <w:t>DIRECTOR NACIONAL DE TALENTO HUMANO</w:t>
       </w:r>
     </w:p>
     <w:p>
@@ -170,7 +187,33 @@
           <w:szCs w:val="20"/>
         </w:rPr>
         <w:tab/>
-        <w:t>xxxxxxxxxxx</w:t>
+      </w:r>
+      <w:r>
+        <w:rPr>
+          <w:rFonts w:ascii="Arial" w:hAnsi="Arial" w:cs="Arial"/>
+          <w:b/>
+          <w:sz w:val="20"/>
+          <w:szCs w:val="20"/>
+        </w:rPr>
+        <w:t>Alexandra Elizabeth</w:t>
+      </w:r>
+      <w:r>
+        <w:rPr>
+          <w:rFonts w:ascii="Arial" w:hAnsi="Arial" w:cs="Arial"/>
+          <w:b/>
+          <w:sz w:val="20"/>
+          <w:szCs w:val="20"/>
+        </w:rPr>
+        <w:t xml:space="preserve"> </w:t>
+      </w:r>
+      <w:r>
+        <w:rPr>
+          <w:rFonts w:ascii="Arial" w:hAnsi="Arial" w:cs="Arial"/>
+          <w:b/>
+          <w:sz w:val="20"/>
+          <w:szCs w:val="20"/>
+        </w:rPr>
+        <w:t>Pasquel Pintado</w:t>
       </w:r>
     </w:p>
     <w:p>
@@ -179,6 +222,11 @@
           <w:bottom w:val="single" w:sz="4" w:space="0" w:color="000000"/>
         </w:pBdr>
         <w:jc w:val="both"/>
+        <w:rPr>
+          <w:rFonts w:ascii="Arial" w:hAnsi="Arial" w:cs="Arial"/>
+          <w:sz w:val="20"/>
+          <w:szCs w:val="20"/>
+        </w:rPr>
       </w:pPr>
       <w:r>
         <w:rPr>
@@ -203,7 +251,64 @@
           <w:szCs w:val="20"/>
         </w:rPr>
         <w:tab/>
-        <w:t>Jefe Inmediato del Servidor/a</w:t>
+        <w:t>Jefe Inmediato del Servidor</w:t>
+      </w:r>
+    </w:p>
+    <w:p>
+      <w:pPr>
+        <w:pBdr>
+          <w:bottom w:val="single" w:sz="4" w:space="0" w:color="000000"/>
+        </w:pBdr>
+        <w:ind w:firstLine="708"/>
+        <w:jc w:val="both"/>
+        <w:rPr>
+          <w:rFonts w:ascii="Arial" w:hAnsi="Arial" w:cs="Arial"/>
+          <w:b/>
+          <w:sz w:val="20"/>
+          <w:szCs w:val="20"/>
+        </w:rPr>
+      </w:pPr>
+    </w:p>
+    <w:p>
+      <w:pPr>
+        <w:pBdr>
+          <w:bottom w:val="single" w:sz="4" w:space="0" w:color="000000"/>
+        </w:pBdr>
+        <w:ind w:firstLine="1416"/>
+        <w:jc w:val="both"/>
+        <w:rPr>
+          <w:rFonts w:ascii="Arial" w:hAnsi="Arial" w:cs="Arial"/>
+          <w:b/>
+          <w:sz w:val="20"/>
+          <w:szCs w:val="20"/>
+        </w:rPr>
+      </w:pPr>
+      <w:r>
+        <w:rPr>
+          <w:rFonts w:ascii="Arial" w:hAnsi="Arial" w:cs="Arial"/>
+          <w:b/>
+          <w:sz w:val="20"/>
+          <w:szCs w:val="20"/>
+        </w:rPr>
+        <w:t>Maria Eulalia</w:t>
+      </w:r>
+      <w:r>
+        <w:rPr>
+          <w:rFonts w:ascii="Arial" w:hAnsi="Arial" w:cs="Arial"/>
+          <w:b/>
+          <w:sz w:val="20"/>
+          <w:szCs w:val="20"/>
+        </w:rPr>
+        <w:t xml:space="preserve"> </w:t>
+      </w:r>
+      <w:r>
+        <w:rPr>
+          <w:rFonts w:ascii="Arial" w:hAnsi="Arial" w:cs="Arial"/>
+          <w:b/>
+          <w:sz w:val="20"/>
+          <w:szCs w:val="20"/>
+        </w:rPr>
+        <w:t>Terreros Brito</w:t>
       </w:r>
     </w:p>
     <w:p>
@@ -214,11 +319,58 @@
         <w:jc w:val="both"/>
         <w:rPr>
           <w:rFonts w:ascii="Arial" w:hAnsi="Arial" w:cs="Arial"/>
-          <w:b/>
-          <w:sz w:val="20"/>
-          <w:szCs w:val="20"/>
-        </w:rPr>
-      </w:pPr>
+          <w:sz w:val="20"/>
+          <w:szCs w:val="20"/>
+        </w:rPr>
+      </w:pPr>
+      <w:r>
+        <w:rPr>
+          <w:rFonts w:ascii="Arial" w:eastAsia="Arial" w:hAnsi="Arial" w:cs="Arial"/>
+          <w:sz w:val="20"/>
+          <w:szCs w:val="20"/>
+        </w:rPr>
+        <w:t xml:space="preserve">           </w:t>
+      </w:r>
+      <w:r>
+        <w:rPr>
+          <w:rFonts w:ascii="Arial" w:hAnsi="Arial" w:cs="Arial"/>
+          <w:sz w:val="20"/>
+          <w:szCs w:val="20"/>
+        </w:rPr>
+        <w:tab/>
+      </w:r>
+      <w:r>
+        <w:rPr>
+          <w:rFonts w:ascii="Arial" w:hAnsi="Arial" w:cs="Arial"/>
+          <w:sz w:val="20"/>
+          <w:szCs w:val="20"/>
+        </w:rPr>
+        <w:tab/>
+      </w:r>
+      <w:r>
+        <w:rPr>
+          <w:rFonts w:ascii="Arial" w:hAnsi="Arial" w:cs="Arial"/>
+          <w:sz w:val="20"/>
+          <w:szCs w:val="20"/>
+        </w:rPr>
+        <w:t xml:space="preserve">Coordinadora </w:t>
+      </w:r>
+      <w:r>
+        <w:rPr>
+          <w:rFonts w:ascii="Arial" w:hAnsi="Arial" w:cs="Arial"/>
+          <w:sz w:val="20"/>
+          <w:szCs w:val="20"/>
+        </w:rPr>
+        <w:t xml:space="preserve">Nacional </w:t>
+      </w:r>
+      <w:r>
+        <w:rPr>
+          <w:rFonts w:ascii="Arial" w:hAnsi="Arial" w:cs="Arial"/>
+          <w:sz w:val="20"/>
+          <w:szCs w:val="20"/>
+        </w:rPr>
+        <w:t>de Remuneraciones</w:t>
+      </w:r>
     </w:p>
     <w:p>
       <w:pPr>
@@ -227,44 +379,12 @@
         </w:pBdr>
         <w:jc w:val="both"/>
         <w:rPr>
-          <w:rFonts w:ascii="Times New Roman" w:hAnsi="Times New Roman" w:cs="Calibri"/>
-        </w:rPr>
-      </w:pPr>
-      <w:r>
-        <w:rPr>
           <w:rFonts w:ascii="Arial" w:hAnsi="Arial" w:cs="Arial"/>
           <w:b/>
           <w:sz w:val="20"/>
           <w:szCs w:val="20"/>
         </w:rPr>
-        <w:t>DE:</w:t>
-      </w:r>
-      <w:r>
-        <w:rPr>
-          <w:rFonts w:ascii="Arial" w:hAnsi="Arial" w:cs="Arial"/>
-          <w:b/>
-          <w:sz w:val="20"/>
-          <w:szCs w:val="20"/>
-        </w:rPr>
-        <w:tab/>
-      </w:r>
-      <w:r>
-        <w:rPr>
-          <w:rFonts w:ascii="Arial" w:hAnsi="Arial" w:cs="Arial"/>
-          <w:b/>
-          <w:sz w:val="20"/>
-          <w:szCs w:val="20"/>
-        </w:rPr>
-        <w:tab/>
-      </w:r>
-      <w:r>
-        <w:rPr>
-          <w:rFonts w:ascii="Arial" w:hAnsi="Arial" w:cs="Arial"/>
-          <w:sz w:val="20"/>
-          <w:szCs w:val="20"/>
-        </w:rPr>
-        <w:t>Nombre del Servidor/a</w:t>
-      </w:r>
+      </w:pPr>
     </w:p>
     <w:p>
       <w:pPr>
@@ -273,12 +393,44 @@
         </w:pBdr>
         <w:jc w:val="both"/>
         <w:rPr>
+          <w:rFonts w:ascii="Times New Roman" w:hAnsi="Times New Roman" w:cs="Calibri"/>
+        </w:rPr>
+      </w:pPr>
+      <w:r>
+        <w:rPr>
           <w:rFonts w:ascii="Arial" w:hAnsi="Arial" w:cs="Arial"/>
           <w:b/>
           <w:sz w:val="20"/>
           <w:szCs w:val="20"/>
         </w:rPr>
-      </w:pPr>
+        <w:t>DE:</w:t>
+      </w:r>
+      <w:r>
+        <w:rPr>
+          <w:rFonts w:ascii="Arial" w:hAnsi="Arial" w:cs="Arial"/>
+          <w:b/>
+          <w:sz w:val="20"/>
+          <w:szCs w:val="20"/>
+        </w:rPr>
+        <w:tab/>
+      </w:r>
+      <w:r>
+        <w:rPr>
+          <w:rFonts w:ascii="Arial" w:hAnsi="Arial" w:cs="Arial"/>
+          <w:b/>
+          <w:sz w:val="20"/>
+          <w:szCs w:val="20"/>
+        </w:rPr>
+        <w:tab/>
+      </w:r>
+      <w:r>
+        <w:rPr>
+          <w:rFonts w:ascii="Arial" w:hAnsi="Arial" w:cs="Arial"/>
+          <w:sz w:val="20"/>
+          <w:szCs w:val="20"/>
+        </w:rPr>
+        <w:t>Carlos Eduardo Anchundia Valencia</w:t>
+      </w:r>
     </w:p>
     <w:p>
       <w:pPr>
@@ -287,35 +439,12 @@
         </w:pBdr>
         <w:jc w:val="both"/>
         <w:rPr>
-          <w:rFonts w:ascii="Times New Roman" w:hAnsi="Times New Roman" w:cs="Calibri"/>
-        </w:rPr>
-      </w:pPr>
-      <w:r>
-        <w:rPr>
           <w:rFonts w:ascii="Arial" w:hAnsi="Arial" w:cs="Arial"/>
           <w:b/>
           <w:sz w:val="20"/>
           <w:szCs w:val="20"/>
         </w:rPr>
-        <w:t>FECHA:</w:t>
-      </w:r>
-      <w:r>
-        <w:rPr>
-          <w:rFonts w:ascii="Arial" w:hAnsi="Arial" w:cs="Arial"/>
-          <w:b/>
-          <w:sz w:val="20"/>
-          <w:szCs w:val="20"/>
-        </w:rPr>
-        <w:tab/>
-      </w:r>
-      <w:r>
-        <w:rPr>
-          <w:rFonts w:ascii="Arial" w:hAnsi="Arial" w:cs="Arial"/>
-          <w:sz w:val="20"/>
-          <w:szCs w:val="20"/>
-        </w:rPr>
-        <w:t>dd/mm/aa</w:t>
-      </w:r>
+      </w:pPr>
     </w:p>
     <w:p>
       <w:pPr>
@@ -324,6 +453,59 @@
         </w:pBdr>
         <w:jc w:val="both"/>
         <w:rPr>
+          <w:rFonts w:ascii="Times New Roman" w:hAnsi="Times New Roman" w:cs="Calibri"/>
+        </w:rPr>
+      </w:pPr>
+      <w:r>
+        <w:rPr>
+          <w:rFonts w:ascii="Arial" w:hAnsi="Arial" w:cs="Arial"/>
+          <w:b/>
+          <w:sz w:val="20"/>
+          <w:szCs w:val="20"/>
+        </w:rPr>
+        <w:t>FECHA:</w:t>
+      </w:r>
+      <w:r>
+        <w:rPr>
+          <w:rFonts w:ascii="Arial" w:hAnsi="Arial" w:cs="Arial"/>
+          <w:b/>
+          <w:sz w:val="20"/>
+          <w:szCs w:val="20"/>
+        </w:rPr>
+        <w:tab/>
+      </w:r>
+      <w:r>
+        <w:rPr>
+          <w:rFonts w:ascii="Arial" w:hAnsi="Arial" w:cs="Arial"/>
+          <w:sz w:val="20"/>
+          <w:szCs w:val="20"/>
+        </w:rPr>
+        <w:t>08/09</w:t>
+      </w:r>
+      <w:r>
+        <w:rPr>
+          <w:rFonts w:ascii="Arial" w:hAnsi="Arial" w:cs="Arial"/>
+          <w:sz w:val="20"/>
+          <w:szCs w:val="20"/>
+        </w:rPr>
+        <w:t>/</w:t>
+      </w:r>
+      <w:r>
+        <w:rPr>
+          <w:rFonts w:ascii="Arial" w:hAnsi="Arial" w:cs="Arial"/>
+          <w:sz w:val="20"/>
+          <w:szCs w:val="20"/>
+        </w:rPr>
+        <w:t>26</w:t>
+      </w:r>
+    </w:p>
+    <w:p>
+      <w:pPr>
+        <w:pBdr>
+          <w:bottom w:val="single" w:sz="4" w:space="0" w:color="000000"/>
+        </w:pBdr>
+        <w:jc w:val="both"/>
+        <w:rPr>
           <w:rFonts w:ascii="Arial" w:hAnsi="Arial" w:cs="Arial"/>
           <w:b/>
           <w:sz w:val="8"/>
@@ -347,6 +529,48 @@
       <w:pPr>
         <w:jc w:val="both"/>
         <w:rPr>
+          <w:rFonts w:ascii="Arial" w:hAnsi="Arial" w:cs="Arial"/>
+          <w:color w:val="000000"/>
+          <w:sz w:val="18"/>
+          <w:szCs w:val="18"/>
+        </w:rPr>
+      </w:pPr>
+    </w:p>
+    <w:p>
+      <w:pPr>
+        <w:jc w:val="both"/>
+        <w:rPr>
+          <w:rFonts w:ascii="Arial" w:hAnsi="Arial" w:cs="Arial"/>
+          <w:color w:val="000000"/>
+          <w:sz w:val="18"/>
+          <w:szCs w:val="18"/>
+        </w:rPr>
+      </w:pPr>
+      <w:r>
+        <w:rPr>
+          <w:rFonts w:ascii="Arial" w:hAnsi="Arial" w:cs="Arial"/>
+          <w:color w:val="000000"/>
+          <w:sz w:val="18"/>
+          <w:szCs w:val="18"/>
+        </w:rPr>
+        <w:t>Estimado director:</w:t>
+      </w:r>
+    </w:p>
+    <w:p>
+      <w:pPr>
+        <w:jc w:val="both"/>
+        <w:rPr>
+          <w:rFonts w:ascii="Arial" w:hAnsi="Arial" w:cs="Arial"/>
+          <w:color w:val="000000"/>
+          <w:sz w:val="18"/>
+          <w:szCs w:val="18"/>
+        </w:rPr>
+      </w:pPr>
+    </w:p>
+    <w:p>
+      <w:pPr>
+        <w:jc w:val="both"/>
+        <w:rPr>
           <w:rFonts w:ascii="Times New Roman" w:hAnsi="Times New Roman" w:cs="Calibri"/>
           <w:sz w:val="18"/>
           <w:szCs w:val="18"/>
@@ -360,49 +584,34 @@
           <w:sz w:val="18"/>
           <w:szCs w:val="18"/>
         </w:rPr>
-        <w:t>Estimado director/a:</w:t>
-      </w:r>
-    </w:p>
-    <w:p>
-      <w:pPr>
-        <w:jc w:val="both"/>
-        <w:rPr>
-          <w:rFonts w:ascii="Arial" w:hAnsi="Arial" w:cs="Arial"/>
-          <w:color w:val="000000"/>
-          <w:sz w:val="18"/>
-          <w:szCs w:val="18"/>
-        </w:rPr>
-      </w:pPr>
-    </w:p>
-    <w:p>
-      <w:pPr>
-        <w:jc w:val="both"/>
-        <w:rPr>
-          <w:rFonts w:ascii="Times New Roman" w:hAnsi="Times New Roman" w:cs="Calibri"/>
-          <w:sz w:val="18"/>
-          <w:szCs w:val="18"/>
-          <w:lang w:eastAsia="zh-CN"/>
-        </w:rPr>
-      </w:pPr>
-      <w:r>
-        <w:rPr>
-          <w:rFonts w:ascii="Arial" w:hAnsi="Arial" w:cs="Arial"/>
-          <w:color w:val="000000"/>
-          <w:sz w:val="18"/>
-          <w:szCs w:val="18"/>
-        </w:rPr>
-        <w:t xml:space="preserve">La presente tiene por objeto poner en su conocimiento, según lo dispuesto en el Art. 102 del Reglamento de la Ley Orgánica del Servicio Público, mi renuncia voluntaria al cargo de…………………………………………………. que actualmente me encuentro desempeñando en la Institución, </w:t>
-      </w:r>
-      <w:r>
-        <w:rPr>
-          <w:rFonts w:ascii="Arial" w:hAnsi="Arial" w:cs="Arial"/>
-          <w:i/>
-          <w:color w:val="000000"/>
-          <w:sz w:val="18"/>
-          <w:szCs w:val="18"/>
-          <w:u w:val="single"/>
-        </w:rPr>
-        <w:t>así como a mi puesto de carrera de ………………………..(de ser el caso)</w:t>
+        <w:t>La presente tiene por objeto poner en su conocimiento, según lo dispuesto en el Art. 102 del Reglamento de la Ley Orgánica del Servicio Público, mi renuncia voluntaria al cargo de</w:t>
+      </w:r>
+      <w:r>
+        <w:rPr>
+          <w:rFonts w:ascii="Arial" w:hAnsi="Arial" w:cs="Arial"/>
+          <w:color w:val="000000"/>
+          <w:sz w:val="18"/>
+          <w:szCs w:val="18"/>
+        </w:rPr>
+        <w:t xml:space="preserve"> Especialista de Desarrollo</w:t>
+      </w:r>
+      <w:r>
+        <w:rPr>
+          <w:rFonts w:ascii="Arial" w:hAnsi="Arial" w:cs="Arial"/>
+          <w:color w:val="000000"/>
+          <w:sz w:val="18"/>
+          <w:szCs w:val="18"/>
+        </w:rPr>
+        <w:t xml:space="preserve"> que actualmente me encuentro desempeñando en la Institución</w:t>
+      </w:r>
+      <w:r>
+        <w:rPr>
+          <w:rFonts w:ascii="Arial" w:hAnsi="Arial" w:cs="Arial"/>
+          <w:color w:val="000000"/>
+          <w:sz w:val="18"/>
+          <w:szCs w:val="18"/>
+        </w:rPr>
+        <w:t>.</w:t>
       </w:r>
     </w:p>
     <w:p>
@@ -503,6 +712,140 @@
       <w:r>
         <w:rPr>
           <w:rFonts w:ascii="Wingdings" w:eastAsia="Wingdings" w:hAnsi="Wingdings" w:cs="Wingdings"/>
+          <w:noProof/>
+          <w:color w:val="000000"/>
+          <w:sz w:val="18"/>
+          <w:szCs w:val="18"/>
+        </w:rPr>
+        <mc:AlternateContent>
+          <mc:Choice Requires="wps">
+            <w:drawing>
+              <wp:anchor distT="0" distB="0" distL="114300" distR="114300" simplePos="0" relativeHeight="251664384" behindDoc="0" locked="0" layoutInCell="1" allowOverlap="1" wp14:anchorId="540C5B74" wp14:editId="69F97F1E">
+                <wp:simplePos x="0" y="0"/>
+                <wp:positionH relativeFrom="column">
+                  <wp:posOffset>25730</wp:posOffset>
+                </wp:positionH>
+                <wp:positionV relativeFrom="paragraph">
+                  <wp:posOffset>20955</wp:posOffset>
+                </wp:positionV>
+                <wp:extent cx="58522" cy="73000"/>
+                <wp:effectExtent l="0" t="0" r="17780" b="22860"/>
+                <wp:wrapNone/>
+                <wp:docPr id="732578970" name="Conector recto 3"/>
+                <wp:cNvGraphicFramePr/>
+                <a:graphic xmlns:a="http://schemas.openxmlformats.org/drawingml/2006/main">
+                  <a:graphicData uri="http://schemas.microsoft.com/office/word/2010/wordprocessingShape">
+                    <wps:wsp>
+                      <wps:cNvCnPr/>
+                      <wps:spPr>
+                        <a:xfrm flipH="1">
+                          <a:off x="0" y="0"/>
+                          <a:ext cx="58522" cy="73000"/>
+                        </a:xfrm>
+                        <a:prstGeom prst="line">
+                          <a:avLst/>
+                        </a:prstGeom>
+                      </wps:spPr>
+                      <wps:style>
+                        <a:lnRef idx="1">
+                          <a:schemeClr val="dk1"/>
+                        </a:lnRef>
+                        <a:fillRef idx="0">
+                          <a:schemeClr val="dk1"/>
+                        </a:fillRef>
+                        <a:effectRef idx="0">
+                          <a:schemeClr val="dk1"/>
+                        </a:effectRef>
+                        <a:fontRef idx="minor">
+                          <a:schemeClr val="tx1"/>
+                        </a:fontRef>
+                      </wps:style>
+                      <wps:bodyPr/>
+                    </wps:wsp>
+                  </a:graphicData>
+                </a:graphic>
+              </wp:anchor>
+            </w:drawing>
+          </mc:Choice>
+          <mc:Fallback>
+            <w:pict>
+              <v:line w14:anchorId="1D05D293" id="Conector recto 3" o:spid="_x0000_s1026" style="position:absolute;flip:x;z-index:251664384;visibility:visible;mso-wrap-style:square;mso-wrap-distance-left:9pt;mso-wrap-distance-top:0;mso-wrap-distance-right:9pt;mso-wrap-distance-bottom:0;mso-position-horizontal:absolute;mso-position-horizontal-relative:text;mso-position-vertical:absolute;mso-position-vertical-relative:text" from="2.05pt,1.65pt" to="6.65pt,7.4pt" o:gfxdata="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" strokecolor="black [3200]" strokeweight=".5pt">
+                <v:stroke joinstyle="miter"/>
+              </v:line>
+            </w:pict>
+          </mc:Fallback>
+        </mc:AlternateContent>
+      </w:r>
+      <w:r>
+        <w:rPr>
+          <w:rFonts w:ascii="Wingdings" w:eastAsia="Wingdings" w:hAnsi="Wingdings" w:cs="Wingdings"/>
+          <w:noProof/>
+          <w:color w:val="000000"/>
+          <w:sz w:val="18"/>
+          <w:szCs w:val="18"/>
+        </w:rPr>
+        <mc:AlternateContent>
+          <mc:Choice Requires="wps">
+            <w:drawing>
+              <wp:anchor distT="0" distB="0" distL="114300" distR="114300" simplePos="0" relativeHeight="251663360" behindDoc="0" locked="0" layoutInCell="1" allowOverlap="1" wp14:anchorId="36B1D3ED" wp14:editId="249F959C">
+                <wp:simplePos x="0" y="0"/>
+                <wp:positionH relativeFrom="column">
+                  <wp:posOffset>12370</wp:posOffset>
+                </wp:positionH>
+                <wp:positionV relativeFrom="paragraph">
+                  <wp:posOffset>14656</wp:posOffset>
+                </wp:positionV>
+                <wp:extent cx="58521" cy="87782"/>
+                <wp:effectExtent l="0" t="0" r="36830" b="26670"/>
+                <wp:wrapNone/>
+                <wp:docPr id="121449066" name="Conector recto 2"/>
+                <wp:cNvGraphicFramePr/>
+                <a:graphic xmlns:a="http://schemas.openxmlformats.org/drawingml/2006/main">
+                  <a:graphicData uri="http://schemas.microsoft.com/office/word/2010/wordprocessingShape">
+                    <wps:wsp>
+                      <wps:cNvCnPr/>
+                      <wps:spPr>
+                        <a:xfrm>
+                          <a:off x="0" y="0"/>
+                          <a:ext cx="58521" cy="87782"/>
+                        </a:xfrm>
+                        <a:prstGeom prst="line">
+                          <a:avLst/>
+                        </a:prstGeom>
+                      </wps:spPr>
+                      <wps:style>
+                        <a:lnRef idx="1">
+                          <a:schemeClr val="dk1"/>
+                        </a:lnRef>
+                        <a:fillRef idx="0">
+                          <a:schemeClr val="dk1"/>
+                        </a:fillRef>
+                        <a:effectRef idx="0">
+                          <a:schemeClr val="dk1"/>
+                        </a:effectRef>
+                        <a:fontRef idx="minor">
+                          <a:schemeClr val="tx1"/>
+                        </a:fontRef>
+                      </wps:style>
+                      <wps:bodyPr/>
+                    </wps:wsp>
+                  </a:graphicData>
+                </a:graphic>
+              </wp:anchor>
+            </w:drawing>
+          </mc:Choice>
+          <mc:Fallback>
+            <w:pict>
+              <v:line w14:anchorId="6E538FBC" id="Conector recto 2" o:spid="_x0000_s1026" style="position:absolute;z-index:251663360;visibility:visible;mso-wrap-style:square;mso-wrap-distance-left:9pt;mso-wrap-distance-top:0;mso-wrap-distance-right:9pt;mso-wrap-distance-bottom:0;mso-position-horizontal:absolute;mso-position-horizontal-relative:text;mso-position-vertical:absolute;mso-position-vertical-relative:text" from=".95pt,1.15pt" to="5.55pt,8.05pt" o:gfxdata="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" strokecolor="black [3200]" strokeweight=".5pt">
+                <v:stroke joinstyle="miter"/>
+              </v:line>
+            </w:pict>
+          </mc:Fallback>
+        </mc:AlternateContent>
+      </w:r>
+      <w:r>
+        <w:rPr>
+          <w:rFonts w:ascii="Wingdings" w:eastAsia="Wingdings" w:hAnsi="Wingdings" w:cs="Wingdings"/>
           <w:color w:val="000000"/>
           <w:sz w:val="18"/>
           <w:szCs w:val="18"/>
@@ -551,7 +894,34 @@
           <w:sz w:val="18"/>
           <w:szCs w:val="18"/>
         </w:rPr>
-        <w:t>Especifique:   ………………………………………………………………………………………</w:t>
+        <w:t xml:space="preserve">Especifique:   </w:t>
+      </w:r>
+      <w:r>
+        <w:rPr>
+          <w:rFonts w:ascii="Arial" w:hAnsi="Arial" w:cs="Arial"/>
+          <w:color w:val="000000"/>
+          <w:sz w:val="18"/>
+          <w:szCs w:val="18"/>
+        </w:rPr>
+        <w:t>G</w:t>
+      </w:r>
+      <w:r>
+        <w:rPr>
+          <w:rFonts w:ascii="Arial" w:hAnsi="Arial" w:cs="Arial"/>
+          <w:color w:val="000000"/>
+          <w:sz w:val="18"/>
+          <w:szCs w:val="18"/>
+        </w:rPr>
+        <w:t>anador de concurso</w:t>
+      </w:r>
+      <w:r>
+        <w:rPr>
+          <w:rFonts w:ascii="Arial" w:hAnsi="Arial" w:cs="Arial"/>
+          <w:color w:val="000000"/>
+          <w:sz w:val="18"/>
+          <w:szCs w:val="18"/>
+        </w:rPr>
+        <w:t xml:space="preserve"> y cambio de partida a gasto corriente.</w:t>
       </w:r>
     </w:p>
     <w:p>
@@ -586,9 +956,17 @@
           <w:sz w:val="18"/>
           <w:szCs w:val="18"/>
         </w:rPr>
-        <w:t xml:space="preserve">Para los fines pertinentes informo que permaneceré en la institución hasta el día (fecha exacta) …………………………, </w:t>
-      </w:r>
-      <w:commentRangeStart w:id="0"/>
+        <w:t xml:space="preserve">Para los fines pertinentes informo que permaneceré en la institución hasta el día </w:t>
+      </w:r>
+      <w:r>
+        <w:rPr>
+          <w:rFonts w:ascii="Arial" w:hAnsi="Arial" w:cs="Arial"/>
+          <w:color w:val="000000"/>
+          <w:sz w:val="18"/>
+          <w:szCs w:val="18"/>
+        </w:rPr>
+        <w:t xml:space="preserve">30 de septiembre de 2026 </w:t>
+      </w:r>
       <w:r>
         <w:rPr>
           <w:rFonts w:ascii="Arial" w:hAnsi="Arial" w:cs="Arial"/>
@@ -617,15 +995,6 @@
         </w:rPr>
         <w:t xml:space="preserve"> de permanencia según menciona el Art. 102 del Reglamento a LOSEP.</w:t>
       </w:r>
-      <w:commentRangeEnd w:id="0"/>
-      <w:r>
-        <w:rPr>
-          <w:rStyle w:val="Refdecomentario"/>
-          <w:sz w:val="18"/>
-          <w:szCs w:val="18"/>
-        </w:rPr>
-        <w:commentReference w:id="0"/>
-      </w:r>
     </w:p>
     <w:p>
       <w:pPr>
@@ -642,132 +1011,10 @@
       <w:pPr>
         <w:jc w:val="both"/>
         <w:rPr>
-          <w:rFonts w:ascii="Arial" w:hAnsi="Arial" w:cs="Arial"/>
-          <w:color w:val="000000"/>
-          <w:sz w:val="18"/>
-          <w:szCs w:val="18"/>
-        </w:rPr>
-      </w:pPr>
-      <w:r>
-        <w:rPr>
-          <w:rFonts w:ascii="Arial" w:hAnsi="Arial" w:cs="Arial"/>
-          <w:color w:val="000000"/>
-          <w:sz w:val="18"/>
-          <w:szCs w:val="18"/>
-        </w:rPr>
-        <w:t xml:space="preserve">Además, declaro que </w:t>
-      </w:r>
-      <w:commentRangeStart w:id="1"/>
-      <w:r>
-        <w:rPr>
-          <w:rFonts w:ascii="Arial" w:hAnsi="Arial" w:cs="Arial"/>
-          <w:color w:val="000000"/>
-          <w:sz w:val="18"/>
-          <w:szCs w:val="18"/>
-        </w:rPr>
-        <w:t xml:space="preserve">NO voy a laborar en una entidad del sector público </w:t>
-      </w:r>
-      <w:commentRangeEnd w:id="1"/>
-      <w:r>
-        <w:rPr>
-          <w:rStyle w:val="Refdecomentario"/>
-          <w:rFonts w:ascii="Arial" w:hAnsi="Arial" w:cs="Arial"/>
-          <w:color w:val="000000"/>
-          <w:sz w:val="18"/>
-          <w:szCs w:val="18"/>
-        </w:rPr>
-        <w:commentReference w:id="1"/>
-      </w:r>
-      <w:r>
-        <w:rPr>
-          <w:rFonts w:ascii="Arial" w:hAnsi="Arial" w:cs="Arial"/>
-          <w:color w:val="000000"/>
-          <w:sz w:val="18"/>
-          <w:szCs w:val="18"/>
-        </w:rPr>
-        <w:t>y me someto a</w:t>
-      </w:r>
-      <w:r>
-        <w:rPr>
-          <w:rFonts w:ascii="Arial" w:hAnsi="Arial" w:cs="Arial"/>
-          <w:color w:val="000000"/>
-          <w:sz w:val="18"/>
-          <w:szCs w:val="18"/>
-        </w:rPr>
-        <w:t xml:space="preserve"> </w:t>
-      </w:r>
-      <w:r>
-        <w:rPr>
-          <w:rFonts w:ascii="Arial" w:hAnsi="Arial" w:cs="Arial"/>
-          <w:color w:val="000000"/>
-          <w:sz w:val="18"/>
-          <w:szCs w:val="18"/>
-        </w:rPr>
-        <w:t>las disposiciones legales pertinentes, por lo cual solicito voluntariamente SI recibir el</w:t>
-      </w:r>
-      <w:r>
-        <w:rPr>
-          <w:rFonts w:ascii="Arial" w:hAnsi="Arial" w:cs="Arial"/>
-          <w:color w:val="000000"/>
-          <w:sz w:val="18"/>
-          <w:szCs w:val="18"/>
-        </w:rPr>
-        <w:t xml:space="preserve"> </w:t>
-      </w:r>
-      <w:r>
-        <w:rPr>
-          <w:rFonts w:ascii="Arial" w:hAnsi="Arial" w:cs="Arial"/>
-          <w:color w:val="000000"/>
-          <w:sz w:val="18"/>
-          <w:szCs w:val="18"/>
-        </w:rPr>
-        <w:t>monto de compensación económica por la renuncia voluntaria no planificada en caso de</w:t>
-      </w:r>
-      <w:r>
-        <w:rPr>
-          <w:rFonts w:ascii="Arial" w:hAnsi="Arial" w:cs="Arial"/>
-          <w:color w:val="000000"/>
-          <w:sz w:val="18"/>
-          <w:szCs w:val="18"/>
-        </w:rPr>
-        <w:t xml:space="preserve"> </w:t>
-      </w:r>
-      <w:r>
-        <w:rPr>
-          <w:rFonts w:ascii="Arial" w:hAnsi="Arial" w:cs="Arial"/>
-          <w:color w:val="000000"/>
-          <w:sz w:val="18"/>
-          <w:szCs w:val="18"/>
-        </w:rPr>
-        <w:t>que corresponda, con base en las definiciones del Ministerio del Trabajo y la</w:t>
-      </w:r>
-      <w:r>
-        <w:rPr>
-          <w:rFonts w:ascii="Arial" w:hAnsi="Arial" w:cs="Arial"/>
-          <w:color w:val="000000"/>
-          <w:sz w:val="18"/>
-          <w:szCs w:val="18"/>
-        </w:rPr>
-        <w:t xml:space="preserve"> </w:t>
-      </w:r>
-      <w:r>
-        <w:rPr>
-          <w:rFonts w:ascii="Arial" w:hAnsi="Arial" w:cs="Arial"/>
-          <w:color w:val="000000"/>
-          <w:sz w:val="18"/>
-          <w:szCs w:val="18"/>
-        </w:rPr>
-        <w:t>disponibilidad presupuestaria asignada por el Ministerio de Economía y Finanzas</w:t>
-      </w:r>
-    </w:p>
-    <w:p>
-      <w:pPr>
-        <w:jc w:val="both"/>
-        <w:rPr>
-          <w:rFonts w:ascii="Arial" w:hAnsi="Arial" w:cs="Arial"/>
-          <w:color w:val="000000"/>
-          <w:sz w:val="18"/>
-          <w:szCs w:val="18"/>
+          <w:rFonts w:ascii="Times New Roman" w:hAnsi="Times New Roman" w:cs="Calibri"/>
+          <w:sz w:val="18"/>
+          <w:szCs w:val="18"/>
+          <w:lang w:eastAsia="zh-CN"/>
         </w:rPr>
       </w:pPr>
       <w:r>
@@ -801,7 +1048,7 @@
                     </pic:cNvPicPr>
                   </pic:nvPicPr>
                   <pic:blipFill>
-                    <a:blip r:embed="rId11" cstate="print">
+                    <a:blip r:embed="rId8" cstate="print">
                       <a:extLst>
                         <a:ext uri="{28A0092B-C50C-407E-A947-70E740481C1C}">
                           <a14:useLocalDpi xmlns:a14="http://schemas.microsoft.com/office/drawing/2010/main" val="0"/>
@@ -869,7 +1116,7 @@
                     </pic:cNvPicPr>
                   </pic:nvPicPr>
                   <pic:blipFill>
-                    <a:blip r:embed="rId11" cstate="print">
+                    <a:blip r:embed="rId8" cstate="print">
                       <a:extLst>
                         <a:ext uri="{28A0092B-C50C-407E-A947-70E740481C1C}">
                           <a14:useLocalDpi xmlns:a14="http://schemas.microsoft.com/office/drawing/2010/main" val="0"/>
@@ -937,7 +1184,7 @@
                     </pic:cNvPicPr>
                   </pic:nvPicPr>
                   <pic:blipFill>
-                    <a:blip r:embed="rId11" cstate="print">
+                    <a:blip r:embed="rId8" cstate="print">
                       <a:extLst>
                         <a:ext uri="{28A0092B-C50C-407E-A947-70E740481C1C}">
                           <a14:useLocalDpi xmlns:a14="http://schemas.microsoft.com/office/drawing/2010/main" val="0"/>
@@ -1005,7 +1252,7 @@
                     </pic:cNvPicPr>
                   </pic:nvPicPr>
                   <pic:blipFill>
-                    <a:blip r:embed="rId11" cstate="print">
+                    <a:blip r:embed="rId8" cstate="print">
                       <a:extLst>
                         <a:ext uri="{28A0092B-C50C-407E-A947-70E740481C1C}">
                           <a14:useLocalDpi xmlns:a14="http://schemas.microsoft.com/office/drawing/2010/main" val="0"/>
@@ -1042,26 +1289,154 @@
           </wp:anchor>
         </w:drawing>
       </w:r>
+      <w:r>
+        <w:rPr>
+          <w:rFonts w:ascii="Arial" w:hAnsi="Arial" w:cs="Arial"/>
+          <w:color w:val="000000"/>
+          <w:sz w:val="18"/>
+          <w:szCs w:val="18"/>
+        </w:rPr>
+        <w:t xml:space="preserve">De existir algún valor a favor del SRI autorizo para que se realice el descuento pertinente de mi liquidación de haberes y otros, así como solicito y autorizo que cualquier comunicación referente a mi desvinculación y liquidación sea notificada a la siguiente dirección de correo electrónico personal </w:t>
+      </w:r>
+      <w:r>
+        <w:rPr>
+          <w:rFonts w:ascii="Arial" w:hAnsi="Arial" w:cs="Arial"/>
+          <w:color w:val="000000"/>
+          <w:sz w:val="18"/>
+          <w:szCs w:val="18"/>
+        </w:rPr>
+        <w:t>e.du.ingcharles@hotmail.com</w:t>
+      </w:r>
     </w:p>
     <w:p>
       <w:pPr>
         <w:jc w:val="both"/>
         <w:rPr>
+          <w:rFonts w:ascii="Arial" w:hAnsi="Arial" w:cs="Arial"/>
+          <w:color w:val="000000"/>
+          <w:sz w:val="18"/>
+          <w:szCs w:val="18"/>
+        </w:rPr>
+      </w:pPr>
+    </w:p>
+    <w:p>
+      <w:pPr>
+        <w:jc w:val="both"/>
+        <w:rPr>
+          <w:rFonts w:ascii="Arial" w:hAnsi="Arial" w:cs="Arial"/>
+          <w:color w:val="000000"/>
+          <w:sz w:val="18"/>
+          <w:szCs w:val="18"/>
+        </w:rPr>
+      </w:pPr>
+    </w:p>
+    <w:p>
+      <w:pPr>
+        <w:jc w:val="both"/>
+        <w:rPr>
+          <w:rFonts w:ascii="Arial" w:hAnsi="Arial" w:cs="Arial"/>
+          <w:color w:val="000000"/>
+          <w:sz w:val="18"/>
+          <w:szCs w:val="18"/>
+        </w:rPr>
+      </w:pPr>
+    </w:p>
+    <w:p>
+      <w:pPr>
+        <w:jc w:val="both"/>
+        <w:rPr>
+          <w:rFonts w:ascii="Arial" w:hAnsi="Arial" w:cs="Arial"/>
+          <w:color w:val="000000"/>
+          <w:sz w:val="18"/>
+          <w:szCs w:val="18"/>
+        </w:rPr>
+      </w:pPr>
+      <w:r>
+        <w:rPr>
+          <w:rFonts w:ascii="Arial" w:hAnsi="Arial" w:cs="Arial"/>
+          <w:color w:val="000000"/>
+          <w:sz w:val="18"/>
+          <w:szCs w:val="18"/>
+        </w:rPr>
+        <w:t>Por la atención que se digne dar a la presente, anticipo mi agradecimiento.</w:t>
+      </w:r>
+    </w:p>
+    <w:p>
+      <w:pPr>
+        <w:jc w:val="both"/>
+        <w:rPr>
+          <w:rFonts w:ascii="Arial" w:hAnsi="Arial" w:cs="Arial"/>
+          <w:color w:val="000000"/>
+          <w:sz w:val="18"/>
+          <w:szCs w:val="18"/>
+        </w:rPr>
+      </w:pPr>
+    </w:p>
+    <w:p>
+      <w:pPr>
+        <w:jc w:val="both"/>
+        <w:rPr>
+          <w:rFonts w:ascii="Arial" w:hAnsi="Arial" w:cs="Arial"/>
+          <w:color w:val="000000"/>
+          <w:sz w:val="18"/>
+          <w:szCs w:val="18"/>
+        </w:rPr>
+      </w:pPr>
+    </w:p>
+    <w:p>
+      <w:pPr>
+        <w:jc w:val="both"/>
+        <w:rPr>
+          <w:rFonts w:ascii="Arial" w:hAnsi="Arial" w:cs="Arial"/>
+          <w:color w:val="000000"/>
+          <w:sz w:val="18"/>
+          <w:szCs w:val="18"/>
+        </w:rPr>
+      </w:pPr>
+    </w:p>
+    <w:p>
+      <w:pPr>
+        <w:jc w:val="both"/>
+        <w:rPr>
+          <w:rFonts w:ascii="Arial" w:hAnsi="Arial" w:cs="Arial"/>
+          <w:color w:val="000000"/>
+          <w:sz w:val="18"/>
+          <w:szCs w:val="18"/>
+        </w:rPr>
+      </w:pPr>
+    </w:p>
+    <w:p>
+      <w:pPr>
+        <w:jc w:val="both"/>
+        <w:rPr>
+          <w:rFonts w:ascii="Arial" w:hAnsi="Arial" w:cs="Arial"/>
+          <w:color w:val="000000"/>
+          <w:sz w:val="18"/>
+          <w:szCs w:val="18"/>
+        </w:rPr>
+      </w:pPr>
+    </w:p>
+    <w:p>
+      <w:pPr>
+        <w:jc w:val="both"/>
+        <w:rPr>
+          <w:rFonts w:ascii="Arial" w:hAnsi="Arial" w:cs="Arial"/>
+          <w:color w:val="000000"/>
+          <w:sz w:val="18"/>
+          <w:szCs w:val="18"/>
+        </w:rPr>
+      </w:pPr>
+    </w:p>
+    <w:p>
+      <w:pPr>
+        <w:jc w:val="both"/>
+        <w:rPr>
           <w:rFonts w:ascii="Times New Roman" w:hAnsi="Times New Roman" w:cs="Calibri"/>
           <w:sz w:val="18"/>
           <w:szCs w:val="18"/>
           <w:lang w:eastAsia="zh-CN"/>
         </w:rPr>
       </w:pPr>
-      <w:r>
-        <w:rPr>
-          <w:rFonts w:ascii="Arial" w:hAnsi="Arial" w:cs="Arial"/>
-          <w:color w:val="000000"/>
-          <w:sz w:val="18"/>
-          <w:szCs w:val="18"/>
-        </w:rPr>
-        <w:t>De existir algún valor a favor del SRI autorizo para que se realice el descuento pertinente de mi liquidación de haberes y otros, así como solicito y autorizo que cualquier comunicación referente a mi desvinculación y liquidación sea notificada a la siguiente dirección de correo electrónico personal __________________________</w:t>
-      </w:r>
     </w:p>
     <w:p>
       <w:pPr>
@@ -1076,29 +1451,6 @@
     </w:p>
     <w:p>
       <w:pPr>
-        <w:jc w:val="both"/>
-        <w:rPr>
-          <w:rFonts w:ascii="Arial" w:hAnsi="Arial" w:cs="Arial"/>
-          <w:color w:val="000000"/>
-          <w:sz w:val="18"/>
-          <w:szCs w:val="18"/>
-        </w:rPr>
-      </w:pPr>
-    </w:p>
-    <w:p>
-      <w:pPr>
-        <w:jc w:val="both"/>
-        <w:rPr>
-          <w:rFonts w:ascii="Arial" w:hAnsi="Arial" w:cs="Arial"/>
-          <w:color w:val="000000"/>
-          <w:sz w:val="18"/>
-          <w:szCs w:val="18"/>
-        </w:rPr>
-      </w:pPr>
-    </w:p>
-    <w:p>
-      <w:pPr>
-        <w:jc w:val="both"/>
         <w:rPr>
           <w:rFonts w:ascii="Times New Roman" w:hAnsi="Times New Roman" w:cs="Calibri"/>
           <w:sz w:val="18"/>
@@ -1109,36 +1461,6 @@
       <w:r>
         <w:rPr>
           <w:rFonts w:ascii="Arial" w:hAnsi="Arial" w:cs="Arial"/>
-          <w:color w:val="000000"/>
-          <w:sz w:val="18"/>
-          <w:szCs w:val="18"/>
-        </w:rPr>
-        <w:t>Por la atención que se digne dar a la presente, anticipo mi agradecimiento.</w:t>
-      </w:r>
-    </w:p>
-    <w:p>
-      <w:pPr>
-        <w:jc w:val="both"/>
-        <w:rPr>
-          <w:rFonts w:ascii="Arial" w:hAnsi="Arial" w:cs="Arial"/>
-          <w:color w:val="000000"/>
-          <w:sz w:val="18"/>
-          <w:szCs w:val="18"/>
-        </w:rPr>
-      </w:pPr>
-    </w:p>
-    <w:p>
-      <w:pPr>
-        <w:rPr>
-          <w:rFonts w:ascii="Times New Roman" w:hAnsi="Times New Roman" w:cs="Calibri"/>
-          <w:sz w:val="18"/>
-          <w:szCs w:val="18"/>
-          <w:lang w:eastAsia="zh-CN"/>
-        </w:rPr>
-      </w:pPr>
-      <w:r>
-        <w:rPr>
-          <w:rFonts w:ascii="Arial" w:hAnsi="Arial" w:cs="Arial"/>
           <w:sz w:val="18"/>
           <w:szCs w:val="18"/>
         </w:rPr>
@@ -1168,30 +1490,38 @@
           <w:sz w:val="18"/>
           <w:szCs w:val="18"/>
         </w:rPr>
-        <w:t>Nombre del servidor</w:t>
-      </w:r>
-    </w:p>
-    <w:p>
-      <w:pPr>
-        <w:rPr>
-          <w:rFonts w:ascii="Arial" w:hAnsi="Arial" w:cs="Arial"/>
-          <w:sz w:val="18"/>
-          <w:szCs w:val="18"/>
-        </w:rPr>
-      </w:pPr>
-      <w:r>
-        <w:rPr>
-          <w:rFonts w:ascii="Arial" w:hAnsi="Arial" w:cs="Arial"/>
-          <w:sz w:val="18"/>
-          <w:szCs w:val="18"/>
-        </w:rPr>
-        <w:t>Cédula de ciudadanía</w:t>
+        <w:t>Carlos Anchundia.</w:t>
+      </w:r>
+    </w:p>
+    <w:p>
+      <w:pPr>
+        <w:rPr>
+          <w:rFonts w:ascii="Arial" w:hAnsi="Arial" w:cs="Arial"/>
+          <w:sz w:val="18"/>
+          <w:szCs w:val="18"/>
+        </w:rPr>
+      </w:pPr>
+      <w:r>
+        <w:rPr>
+          <w:rFonts w:ascii="Arial" w:hAnsi="Arial" w:cs="Arial"/>
+          <w:sz w:val="18"/>
+          <w:szCs w:val="18"/>
+        </w:rPr>
+        <w:t xml:space="preserve">CI: </w:t>
+      </w:r>
+      <w:r>
+        <w:rPr>
+          <w:rFonts w:ascii="Arial" w:hAnsi="Arial" w:cs="Arial"/>
+          <w:sz w:val="18"/>
+          <w:szCs w:val="18"/>
+        </w:rPr>
+        <w:t>1722039953</w:t>
       </w:r>
     </w:p>
     <w:p/>
     <w:sectPr>
-      <w:headerReference w:type="default" r:id="rId12"/>
-      <w:footerReference w:type="default" r:id="rId13"/>
+      <w:headerReference w:type="default" r:id="rId9"/>
+      <w:footerReference w:type="default" r:id="rId10"/>
       <w:pgSz w:w="11900" w:h="16840"/>
       <w:pgMar w:top="2155" w:right="1977" w:bottom="1417" w:left="1985" w:header="0" w:footer="2180" w:gutter="0"/>
       <w:cols w:space="708"/>
@@ -1201,66 +1531,8 @@
 </w:document>
 </file>
 
-<file path=word/comments.xml><?xml version="1.0" encoding="utf-8"?>
-<w:comments xmlns:wpc="http://schemas.microsoft.com/office/word/2010/wordprocessingCanvas" xmlns:cx="http://schemas.microsoft.com/office/drawing/2014/chartex" xmlns:cx1="http://schemas.microsoft.com/office/drawing/2015/9/8/chartex" xmlns:cx2="http://schemas.microsoft.com/office/drawing/2015/10/21/chartex" xmlns:cx3="http://schemas.microsoft.com/office/drawing/2016/5/9/chartex" xmlns:cx4="http://schemas.microsoft.com/office/drawing/2016/5/10/chartex" xmlns:cx5="http://schemas.microsoft.com/office/drawing/2016/5/11/chartex" xmlns:cx6="http://schemas.microsoft.com/office/drawing/2016/5/12/chartex" xmlns:cx7="http://schemas.microsoft.com/office/drawing/2016/5/13/chartex" xmlns:cx8="http://schemas.microsoft.com/office/drawing/2016/5/14/chartex" xmlns:mc="http://schemas.openxmlformats.org/markup-compatibility/2006" xmlns:aink="http://schemas.microsoft.com/office/drawing/2016/ink" xmlns:am3d="http://schemas.microsoft.com/office/drawing/2017/model3d" xmlns:o="urn:schemas-microsoft-com:office:office" xmlns:oel="http://schemas.microsoft.com/office/2019/extlst" xmlns:r="http://schemas.openxmlformats.org/officeDocument/2006/relationships" xmlns:m="http://schemas.openxmlformats.org/officeDocument/2006/math" xmlns:v="urn:schemas-microsoft-com:vml" xmlns:wp14="http://schemas.microsoft.com/office/word/2010/wordprocessingDrawing" xmlns:wp="http://schemas.openxmlformats.org/drawingml/2006/wordprocessingDrawing" xmlns:w10="urn:schemas-microsoft-com:office:word" xmlns:w="http://schemas.openxmlformats.org/wordprocessingml/2006/main" xmlns:w14="http://schemas.microsoft.com/office/word/2010/wordml" xmlns:w15="http://schemas.microsoft.com/office/word/2012/wordml" xmlns:w16cex="http://schemas.microsoft.com/office/word/2018/wordml/cex" xmlns:w16cid="http://schemas.microsoft.com/office/word/2016/wordml/cid" xmlns:w16="http://schemas.microsoft.com/office/word/2018/wordml" xmlns:w16du="http://schemas.microsoft.com/office/word/2023/wordml/word16du" xmlns:w16sdtdh="http://schemas.microsoft.com/office/word/2020/wordml/sdtdatahash" xmlns:w16sdtfl="http://schemas.microsoft.com/office/word/2024/wordml/sdtformatlock" xmlns:w16se="http://schemas.microsoft.com/office/word/2015/wordml/symex" xmlns:wpg="http://schemas.microsoft.com/office/word/2010/wordprocessingGroup" xmlns:wpi="http://schemas.microsoft.com/office/word/2010/wordprocessingInk" xmlns:wne="http://schemas.microsoft.com/office/word/2006/wordml" xmlns:wps="http://schemas.microsoft.com/office/word/2010/wordprocessingShape" mc:Ignorable="w14 w15 w16se w16cid w16 w16cex w16sdtdh w16sdtfl w16du wp14">
-  <w:comment w:id="0" w:author="Rodriguez Villagomez, Ligia Elena" w:date="2026-03-27T16:52:00Z" w:initials="LR">
-    <w:p>
-      <w:pPr>
-        <w:pStyle w:val="Textocomentario"/>
-      </w:pPr>
-      <w:r>
-        <w:rPr>
-          <w:rStyle w:val="Refdecomentario"/>
-        </w:rPr>
-        <w:annotationRef/>
-      </w:r>
-      <w:r>
-        <w:t>Mantener si va a cumplir los 15 días, caso contrario eliminar.</w:t>
-      </w:r>
-    </w:p>
-  </w:comment>
-  <w:comment w:id="1" w:author="Zambrano Hernandez, Maria Fernanda" w:date="2026-07-15T10:27:00Z" w:initials="MZ">
-    <w:p>
-      <w:pPr>
-        <w:pStyle w:val="Textocomentario"/>
-      </w:pPr>
-      <w:r>
-        <w:rPr>
-          <w:rStyle w:val="Refdecomentario"/>
-        </w:rPr>
-        <w:annotationRef/>
-      </w:r>
-      <w:r>
-        <w:t>Servidores de Carrera</w:t>
-      </w:r>
-    </w:p>
-  </w:comment>
-</w:comments>
-</file>
-
-<file path=word/commentsExtended.xml><?xml version="1.0" encoding="utf-8"?>
-<w15:commentsEx xmlns:wpc="http://schemas.microsoft.com/office/word/2010/wordprocessingCanvas" xmlns:cx="http://schemas.microsoft.com/office/drawing/2014/chartex" xmlns:cx1="http://schemas.microsoft.com/office/drawing/2015/9/8/chartex" xmlns:cx2="http://schemas.microsoft.com/office/drawing/2015/10/21/chartex" xmlns:cx3="http://schemas.microsoft.com/office/drawing/2016/5/9/chartex" xmlns:cx4="http://schemas.microsoft.com/office/drawing/2016/5/10/chartex" xmlns:cx5="http://schemas.microsoft.com/office/drawing/2016/5/11/chartex" xmlns:cx6="http://schemas.microsoft.com/office/drawing/2016/5/12/chartex" xmlns:cx7="http://schemas.microsoft.com/office/drawing/2016/5/13/chartex" xmlns:cx8="http://schemas.microsoft.com/office/drawing/2016/5/14/chartex" xmlns:mc="http://schemas.openxmlformats.org/markup-compatibility/2006" xmlns:aink="http://schemas.microsoft.com/office/drawing/2016/ink" xmlns:am3d="http://schemas.microsoft.com/office/drawing/2017/model3d" xmlns:o="urn:schemas-microsoft-com:office:office" xmlns:oel="http://schemas.microsoft.com/office/2019/extlst" xmlns:r="http://schemas.openxmlformats.org/officeDocument/2006/relationships" xmlns:m="http://schemas.openxmlformats.org/officeDocument/2006/math" xmlns:v="urn:schemas-microsoft-com:vml" xmlns:wp14="http://schemas.microsoft.com/office/word/2010/wordprocessingDrawing" xmlns:wp="http://schemas.openxmlformats.org/drawingml/2006/wordprocessingDrawing" xmlns:w10="urn:schemas-microsoft-com:office:word" xmlns:w="http://schemas.openxmlformats.org/wordprocessingml/2006/main" xmlns:w14="http://schemas.microsoft.com/office/word/2010/wordml" xmlns:w15="http://schemas.microsoft.com/office/word/2012/wordml" xmlns:w16cex="http://schemas.microsoft.com/office/word/2018/wordml/cex" xmlns:w16cid="http://schemas.microsoft.com/office/word/2016/wordml/cid" xmlns:w16="http://schemas.microsoft.com/office/word/2018/wordml" xmlns:w16du="http://schemas.microsoft.com/office/word/2023/wordml/word16du" xmlns:w16sdtdh="http://schemas.microsoft.com/office/word/2020/wordml/sdtdatahash" xmlns:w16sdtfl="http://schemas.microsoft.com/office/word/2024/wordml/sdtformatlock" xmlns:w16se="http://schemas.microsoft.com/office/word/2015/wordml/symex" xmlns:wpg="http://schemas.microsoft.com/office/word/2010/wordprocessingGroup" xmlns:wpi="http://schemas.microsoft.com/office/word/2010/wordprocessingInk" xmlns:wne="http://schemas.microsoft.com/office/word/2006/wordml" xmlns:wps="http://schemas.microsoft.com/office/word/2010/wordprocessingShape" mc:Ignorable="w14 w15 w16se w16cid w16 w16cex w16sdtdh w16sdtfl w16du wp14">
-  <w15:commentEx w15:paraId="11CC3C5B" w15:done="0"/>
-  <w15:commentEx w15:paraId="69F1AEDF" w15:done="0"/>
-</w15:commentsEx>
-</file>
-
-<file path=word/commentsExtensible.xml><?xml version="1.0" encoding="utf-8"?>
-<w16cex:commentsExtensible xmlns:wpc="http://schemas.microsoft.com/office/word/2010/wordprocessingCanvas" xmlns:cx="http://schemas.microsoft.com/office/drawing/2014/chartex" xmlns:cx1="http://schemas.microsoft.com/office/drawing/2015/9/8/chartex" xmlns:cx2="http://schemas.microsoft.com/office/drawing/2015/10/21/chartex" xmlns:cx3="http://schemas.microsoft.com/office/drawing/2016/5/9/chartex" xmlns:cx4="http://schemas.microsoft.com/office/drawing/2016/5/10/chartex" xmlns:cx5="http://schemas.microsoft.com/office/drawing/2016/5/11/chartex" xmlns:cx6="http://schemas.microsoft.com/office/drawing/2016/5/12/chartex" xmlns:cx7="http://schemas.microsoft.com/office/drawing/2016/5/13/chartex" xmlns:cx8="http://schemas.microsoft.com/office/drawing/2016/5/14/chartex" xmlns:cr="http://schemas.microsoft.com/office/comments/2020/reactions" xmlns:mc="http://schemas.openxmlformats.org/markup-compatibility/2006" xmlns:aink="http://schemas.microsoft.com/office/drawing/2016/ink" xmlns:am3d="http://schemas.microsoft.com/office/drawing/2017/model3d" xmlns:o="urn:schemas-microsoft-com:office:office" xmlns:oel="http://schemas.microsoft.com/office/2019/extlst" xmlns:r="http://schemas.openxmlformats.org/officeDocument/2006/relationships" xmlns:m="http://schemas.openxmlformats.org/officeDocument/2006/math" xmlns:v="urn:schemas-microsoft-com:vml" xmlns:wp14="http://schemas.microsoft.com/office/word/2010/wordprocessingDrawing" xmlns:wp="http://schemas.openxmlformats.org/drawingml/2006/wordprocessingDrawing" xmlns:w10="urn:schemas-microsoft-com:office:word" xmlns:w="http://schemas.openxmlformats.org/wordprocessingml/2006/main" xmlns:w14="http://schemas.microsoft.com/office/word/2010/wordml" xmlns:w15="http://schemas.microsoft.com/office/word/2012/wordml" xmlns:w16cex="http://schemas.microsoft.com/office/word/2018/wordml/cex" xmlns:w16cid="http://schemas.microsoft.com/office/word/2016/wordml/cid" xmlns:w16="http://schemas.microsoft.com/office/word/2018/wordml" xmlns:w16du="http://schemas.microsoft.com/office/word/2023/wordml/word16du" xmlns:w16sdtdh="http://schemas.microsoft.com/office/word/2020/wordml/sdtdatahash" xmlns:w16sdtfl="http://schemas.microsoft.com/office/word/2024/wordml/sdtformatlock" xmlns:w16se="http://schemas.microsoft.com/office/word/2015/wordml/symex" xmlns:wpg="http://schemas.microsoft.com/office/word/2010/wordprocessingGroup" xmlns:wpi="http://schemas.microsoft.com/office/word/2010/wordprocessingInk" xmlns:wne="http://schemas.microsoft.com/office/word/2006/wordml" xmlns:wps="http://schemas.microsoft.com/office/word/2010/wordprocessingShape" mc:Ignorable="w14 w15 w16se w16cid w16 w16cex w16sdtdh w16sdtfl cr w16du wp14">
-  <w16cex:commentExtensible w16cex:durableId="42C11264" w16cex:dateUtc="2026-03-27T21:52:00Z"/>
-  <w16cex:commentExtensible w16cex:durableId="57B0B547" w16cex:dateUtc="2026-07-15T15:27:00Z"/>
-</w16cex:commentsExtensible>
-</file>
-
-<file path=word/commentsIds.xml><?xml version="1.0" encoding="utf-8"?>
-<w16cid:commentsIds xmlns:wpc="http://schemas.microsoft.com/office/word/2010/wordprocessingCanvas" xmlns:cx="http://schemas.microsoft.com/office/drawing/2014/chartex" xmlns:cx1="http://schemas.microsoft.com/office/drawing/2015/9/8/chartex" xmlns:cx2="http://schemas.microsoft.com/office/drawing/2015/10/21/chartex" xmlns:cx3="http://schemas.microsoft.com/office/drawing/2016/5/9/chartex" xmlns:cx4="http://schemas.microsoft.com/office/drawing/2016/5/10/chartex" xmlns:cx5="http://schemas.microsoft.com/office/drawing/2016/5/11/chartex" xmlns:cx6="http://schemas.microsoft.com/office/drawing/2016/5/12/chartex" xmlns:cx7="http://schemas.microsoft.com/office/drawing/2016/5/13/chartex" xmlns:cx8="http://schemas.microsoft.com/office/drawing/2016/5/14/chartex" xmlns:mc="http://schemas.openxmlformats.org/markup-compatibility/2006" xmlns:aink="http://schemas.microsoft.com/office/drawing/2016/ink" xmlns:am3d="http://schemas.microsoft.com/office/drawing/2017/model3d" xmlns:o="urn:schemas-microsoft-com:office:office" xmlns:oel="http://schemas.microsoft.com/office/2019/extlst" xmlns:r="http://schemas.openxmlformats.org/officeDocument/2006/relationships" xmlns:m="http://schemas.openxmlformats.org/officeDocument/2006/math" xmlns:v="urn:schemas-microsoft-com:vml" xmlns:wp14="http://schemas.microsoft.com/office/word/2010/wordprocessingDrawing" xmlns:wp="http://schemas.openxmlformats.org/drawingml/2006/wordprocessingDrawing" xmlns:w10="urn:schemas-microsoft-com:office:word" xmlns:w="http://schemas.openxmlformats.org/wordprocessingml/2006/main" xmlns:w14="http://schemas.microsoft.com/office/word/2010/wordml" xmlns:w15="http://schemas.microsoft.com/office/word/2012/wordml" xmlns:w16cex="http://schemas.microsoft.com/office/word/2018/wordml/cex" xmlns:w16cid="http://schemas.microsoft.com/office/word/2016/wordml/cid" xmlns:w16="http://schemas.microsoft.com/office/word/2018/wordml" xmlns:w16du="http://schemas.microsoft.com/office/word/2023/wordml/word16du" xmlns:w16sdtdh="http://schemas.microsoft.com/office/word/2020/wordml/sdtdatahash" xmlns:w16sdtfl="http://schemas.microsoft.com/office/word/2024/wordml/sdtformatlock" xmlns:w16se="http://schemas.microsoft.com/office/word/2015/wordml/symex" xmlns:wpg="http://schemas.microsoft.com/office/word/2010/wordprocessingGroup" xmlns:wpi="http://schemas.microsoft.com/office/word/2010/wordprocessingInk" xmlns:wne="http://schemas.microsoft.com/office/word/2006/wordml" xmlns:wps="http://schemas.microsoft.com/office/word/2010/wordprocessingShape" mc:Ignorable="w14 w15 w16se w16cid w16 w16cex w16sdtdh w16sdtfl w16du wp14">
-  <w16cid:commentId w16cid:paraId="11CC3C5B" w16cid:durableId="42C11264"/>
-  <w16cid:commentId w16cid:paraId="69F1AEDF" w16cid:durableId="57B0B547"/>
-</w16cid:commentsIds>
-</file>
-
 <file path=word/endnotes.xml><?xml version="1.0" encoding="utf-8"?>
-<w:endnotes xmlns:wpc="http://schemas.microsoft.com/office/word/2010/wordprocessingCanvas" xmlns:cx="http://schemas.microsoft.com/office/drawing/2014/chartex" xmlns:cx1="http://schemas.microsoft.com/office/drawing/2015/9/8/chartex" xmlns:cx2="http://schemas.microsoft.com/office/drawing/2015/10/21/chartex" xmlns:cx3="http://schemas.microsoft.com/office/drawing/2016/5/9/chartex" xmlns:cx4="http://schemas.microsoft.com/office/drawing/2016/5/10/chartex" xmlns:cx5="http://schemas.microsoft.com/office/drawing/2016/5/11/chartex" xmlns:cx6="http://schemas.microsoft.com/office/drawing/2016/5/12/chartex" xmlns:cx7="http://schemas.microsoft.com/office/drawing/2016/5/13/chartex" xmlns:cx8="http://schemas.microsoft.com/office/drawing/2016/5/14/chartex" xmlns:mc="http://schemas.openxmlformats.org/markup-compatibility/2006" xmlns:aink="http://schemas.microsoft.com/office/drawing/2016/ink" xmlns:am3d="http://schemas.microsoft.com/office/drawing/2017/model3d" xmlns:o="urn:schemas-microsoft-com:office:office" xmlns:oel="http://schemas.microsoft.com/office/2019/extlst" xmlns:r="http://schemas.openxmlformats.org/officeDocument/2006/relationships" xmlns:m="http://schemas.openxmlformats.org/officeDocument/2006/math" xmlns:v="urn:schemas-microsoft-com:vml" xmlns:wp14="http://schemas.microsoft.com/office/word/2010/wordprocessingDrawing" xmlns:wp="http://schemas.openxmlformats.org/drawingml/2006/wordprocessingDrawing" xmlns:w10="urn:schemas-microsoft-com:office:word" xmlns:w="http://schemas.openxmlformats.org/wordprocessingml/2006/main" xmlns:w14="http://schemas.microsoft.com/office/word/2010/wordml" xmlns:w15="http://schemas.microsoft.com/office/word/2012/wordml" xmlns:w16cex="http://schemas.microsoft.com/office/word/2018/wordml/cex" xmlns:w16cid="http://schemas.microsoft.com/office/word/2016/wordml/cid" xmlns:w16="http://schemas.microsoft.com/office/word/2018/wordml" xmlns:w16du="http://schemas.microsoft.com/office/word/2023/wordml/word16du" xmlns:w16sdtdh="http://schemas.microsoft.com/office/word/2020/wordml/sdtdatahash" xmlns:w16sdtfl="http://schemas.microsoft.com/office/word/2024/wordml/sdtformatlock" xmlns:w16se="http://schemas.microsoft.com/office/word/2015/wordml/symex" xmlns:wpg="http://schemas.microsoft.com/office/word/2010/wordprocessingGroup" xmlns:wpi="http://schemas.microsoft.com/office/word/2010/wordprocessingInk" xmlns:wne="http://schemas.microsoft.com/office/word/2006/wordml" xmlns:wps="http://schemas.microsoft.com/office/word/2010/wordprocessingShape" mc:Ignorable="w14 w15 w16se w16cid w16 w16cex w16sdtdh w16sdtfl w16du wp14">
+<w:endnotes xmlns:wpc="http://schemas.microsoft.com/office/word/2010/wordprocessingCanvas" xmlns:cx="http://schemas.microsoft.com/office/drawing/2014/chartex" xmlns:cx1="http://schemas.microsoft.com/office/drawing/2015/9/8/chartex" xmlns:cx2="http://schemas.microsoft.com/office/drawing/2015/10/21/chartex" xmlns:cx3="http://schemas.microsoft.com/office/drawing/2016/5/9/chartex" xmlns:cx4="http://schemas.microsoft.com/office/drawing/2016/5/10/chartex" xmlns:cx5="http://schemas.microsoft.com/office/drawing/2016/5/11/chartex" xmlns:cx6="http://schemas.microsoft.com/office/drawing/2016/5/12/chartex" xmlns:cx7="http://schemas.microsoft.com/office/drawing/2016/5/13/chartex" xmlns:cx8="http://schemas.microsoft.com/office/drawing/2016/5/14/chartex" xmlns:mc="http://schemas.openxmlformats.org/markup-compatibility/2006" xmlns:aink="http://schemas.microsoft.com/office/drawing/2016/ink" xmlns:am3d="http://schemas.microsoft.com/office/drawing/2017/model3d" xmlns:o="urn:schemas-microsoft-com:office:office" xmlns:oel="http://schemas.microsoft.com/office/2019/extlst" xmlns:r="http://schemas.openxmlformats.org/officeDocument/2006/relationships" xmlns:m="http://schemas.openxmlformats.org/officeDocument/2006/math" xmlns:v="urn:schemas-microsoft-com:vml" xmlns:wp14="http://schemas.microsoft.com/office/word/2010/wordprocessingDrawing" xmlns:wp="http://schemas.openxmlformats.org/drawingml/2006/wordprocessingDrawing" xmlns:w10="urn:schemas-microsoft-com:office:word" xmlns:w="http://schemas.openxmlformats.org/wordprocessingml/2006/main" xmlns:w14="http://schemas.microsoft.com/office/word/2010/wordml" xmlns:w15="http://schemas.microsoft.com/office/word/2012/wordml" xmlns:w16cei="http://schemas.microsoft.com/office/word/2026/wordml/cei" xmlns:w16cex="http://schemas.microsoft.com/office/word/2018/wordml/cex" xmlns:w16cid="http://schemas.microsoft.com/office/word/2016/wordml/cid" xmlns:w16="http://schemas.microsoft.com/office/word/2018/wordml" xmlns:w16du="http://schemas.microsoft.com/office/word/2023/wordml/word16du" xmlns:w16sdtdh="http://schemas.microsoft.com/office/word/2020/wordml/sdtdatahash" xmlns:w16sdtfl="http://schemas.microsoft.com/office/word/2024/wordml/sdtformatlock" xmlns:w16se="http://schemas.microsoft.com/office/word/2015/wordml/symex" xmlns:wpg="http://schemas.microsoft.com/office/word/2010/wordprocessingGroup" xmlns:wpi="http://schemas.microsoft.com/office/word/2010/wordprocessingInk" xmlns:wne="http://schemas.microsoft.com/office/word/2006/wordml" xmlns:wps="http://schemas.microsoft.com/office/word/2010/wordprocessingShape" mc:Ignorable="w14 w15 w16se w16cid w16 w16cex w16sdtdh w16sdtfl w16du wp14">
   <w:endnote w:type="separator" w:id="-1">
     <w:p>
       <w:r>
@@ -1279,7 +1551,7 @@
 </file>
 
 <file path=word/footer1.xml><?xml version="1.0" encoding="utf-8"?>
-<w:ftr xmlns:wpc="http://schemas.microsoft.com/office/word/2010/wordprocessingCanvas" xmlns:cx="http://schemas.microsoft.com/office/drawing/2014/chartex" xmlns:cx1="http://schemas.microsoft.com/office/drawing/2015/9/8/chartex" xmlns:cx2="http://schemas.microsoft.com/office/drawing/2015/10/21/chartex" xmlns:cx3="http://schemas.microsoft.com/office/drawing/2016/5/9/chartex" xmlns:cx4="http://schemas.microsoft.com/office/drawing/2016/5/10/chartex" xmlns:cx5="http://schemas.microsoft.com/office/drawing/2016/5/11/chartex" xmlns:cx6="http://schemas.microsoft.com/office/drawing/2016/5/12/chartex" xmlns:cx7="http://schemas.microsoft.com/office/drawing/2016/5/13/chartex" xmlns:cx8="http://schemas.microsoft.com/office/drawing/2016/5/14/chartex" xmlns:mc="http://schemas.openxmlformats.org/markup-compatibility/2006" xmlns:aink="http://schemas.microsoft.com/office/drawing/2016/ink" xmlns:am3d="http://schemas.microsoft.com/office/drawing/2017/model3d" xmlns:o="urn:schemas-microsoft-com:office:office" xmlns:oel="http://schemas.microsoft.com/office/2019/extlst" xmlns:r="http://schemas.openxmlformats.org/officeDocument/2006/relationships" xmlns:m="http://schemas.openxmlformats.org/officeDocument/2006/math" xmlns:v="urn:schemas-microsoft-com:vml" xmlns:wp14="http://schemas.microsoft.com/office/word/2010/wordprocessingDrawing" xmlns:wp="http://schemas.openxmlformats.org/drawingml/2006/wordprocessingDrawing" xmlns:w10="urn:schemas-microsoft-com:office:word" xmlns:w="http://schemas.openxmlformats.org/wordprocessingml/2006/main" xmlns:w14="http://schemas.microsoft.com/office/word/2010/wordml" xmlns:w15="http://schemas.microsoft.com/office/word/2012/wordml" xmlns:w16cex="http://schemas.microsoft.com/office/word/2018/wordml/cex" xmlns:w16cid="http://schemas.microsoft.com/office/word/2016/wordml/cid" xmlns:w16="http://schemas.microsoft.com/office/word/2018/wordml" xmlns:w16du="http://schemas.microsoft.com/office/word/2023/wordml/word16du" xmlns:w16sdtdh="http://schemas.microsoft.com/office/word/2020/wordml/sdtdatahash" xmlns:w16sdtfl="http://schemas.microsoft.com/office/word/2024/wordml/sdtformatlock" xmlns:w16se="http://schemas.microsoft.com/office/word/2015/wordml/symex" xmlns:wpg="http://schemas.microsoft.com/office/word/2010/wordprocessingGroup" xmlns:wpi="http://schemas.microsoft.com/office/word/2010/wordprocessingInk" xmlns:wne="http://schemas.microsoft.com/office/word/2006/wordml" xmlns:wps="http://schemas.microsoft.com/office/word/2010/wordprocessingShape" mc:Ignorable="w14 w15 w16se w16cid w16 w16cex w16sdtdh w16sdtfl w16du wp14">
+<w:ftr xmlns:wpc="http://schemas.microsoft.com/office/word/2010/wordprocessingCanvas" xmlns:cx="http://schemas.microsoft.com/office/drawing/2014/chartex" xmlns:cx1="http://schemas.microsoft.com/office/drawing/2015/9/8/chartex" xmlns:cx2="http://schemas.microsoft.com/office/drawing/2015/10/21/chartex" xmlns:cx3="http://schemas.microsoft.com/office/drawing/2016/5/9/chartex" xmlns:cx4="http://schemas.microsoft.com/office/drawing/2016/5/10/chartex" xmlns:cx5="http://schemas.microsoft.com/office/drawing/2016/5/11/chartex" xmlns:cx6="http://schemas.microsoft.com/office/drawing/2016/5/12/chartex" xmlns:cx7="http://schemas.microsoft.com/office/drawing/2016/5/13/chartex" xmlns:cx8="http://schemas.microsoft.com/office/drawing/2016/5/14/chartex" xmlns:mc="http://schemas.openxmlformats.org/markup-compatibility/2006" xmlns:aink="http://schemas.microsoft.com/office/drawing/2016/ink" xmlns:am3d="http://schemas.microsoft.com/office/drawing/2017/model3d" xmlns:o="urn:schemas-microsoft-com:office:office" xmlns:oel="http://schemas.microsoft.com/office/2019/extlst" xmlns:r="http://schemas.openxmlformats.org/officeDocument/2006/relationships" xmlns:m="http://schemas.openxmlformats.org/officeDocument/2006/math" xmlns:v="urn:schemas-microsoft-com:vml" xmlns:wp14="http://schemas.microsoft.com/office/word/2010/wordprocessingDrawing" xmlns:wp="http://schemas.openxmlformats.org/drawingml/2006/wordprocessingDrawing" xmlns:w10="urn:schemas-microsoft-com:office:word" xmlns:w="http://schemas.openxmlformats.org/wordprocessingml/2006/main" xmlns:w14="http://schemas.microsoft.com/office/word/2010/wordml" xmlns:w15="http://schemas.microsoft.com/office/word/2012/wordml" xmlns:w16cei="http://schemas.microsoft.com/office/word/2026/wordml/cei" xmlns:w16cex="http://schemas.microsoft.com/office/word/2018/wordml/cex" xmlns:w16cid="http://schemas.microsoft.com/office/word/2016/wordml/cid" xmlns:w16="http://schemas.microsoft.com/office/word/2018/wordml" xmlns:w16du="http://schemas.microsoft.com/office/word/2023/wordml/word16du" xmlns:w16sdtdh="http://schemas.microsoft.com/office/word/2020/wordml/sdtdatahash" xmlns:w16sdtfl="http://schemas.microsoft.com/office/word/2024/wordml/sdtformatlock" xmlns:w16se="http://schemas.microsoft.com/office/word/2015/wordml/symex" xmlns:wpg="http://schemas.microsoft.com/office/word/2010/wordprocessingGroup" xmlns:wpi="http://schemas.microsoft.com/office/word/2010/wordprocessingInk" xmlns:wne="http://schemas.microsoft.com/office/word/2006/wordml" xmlns:wps="http://schemas.microsoft.com/office/word/2010/wordprocessingShape" mc:Ignorable="w14 w15 w16se w16cid w16 w16cex w16sdtdh w16sdtfl w16du wp14">
   <w:p>
     <w:pPr>
       <w:pStyle w:val="Piedepgina"/>
@@ -1714,7 +1986,7 @@
 </file>
 
 <file path=word/footnotes.xml><?xml version="1.0" encoding="utf-8"?>
-<w:footnotes xmlns:wpc="http://schemas.microsoft.com/office/word/2010/wordprocessingCanvas" xmlns:cx="http://schemas.microsoft.com/office/drawing/2014/chartex" xmlns:cx1="http://schemas.microsoft.com/office/drawing/2015/9/8/chartex" xmlns:cx2="http://schemas.microsoft.com/office/drawing/2015/10/21/chartex" xmlns:cx3="http://schemas.microsoft.com/office/drawing/2016/5/9/chartex" xmlns:cx4="http://schemas.microsoft.com/office/drawing/2016/5/10/chartex" xmlns:cx5="http://schemas.microsoft.com/office/drawing/2016/5/11/chartex" xmlns:cx6="http://schemas.microsoft.com/office/drawing/2016/5/12/chartex" xmlns:cx7="http://schemas.microsoft.com/office/drawing/2016/5/13/chartex" xmlns:cx8="http://schemas.microsoft.com/office/drawing/2016/5/14/chartex" xmlns:mc="http://schemas.openxmlformats.org/markup-compatibility/2006" xmlns:aink="http://schemas.microsoft.com/office/drawing/2016/ink" xmlns:am3d="http://schemas.microsoft.com/office/drawing/2017/model3d" xmlns:o="urn:schemas-microsoft-com:office:office" xmlns:oel="http://schemas.microsoft.com/office/2019/extlst" xmlns:r="http://schemas.openxmlformats.org/officeDocument/2006/relationships" xmlns:m="http://schemas.openxmlformats.org/officeDocument/2006/math" xmlns:v="urn:schemas-microsoft-com:vml" xmlns:wp14="http://schemas.microsoft.com/office/word/2010/wordprocessingDrawing" xmlns:wp="http://schemas.openxmlformats.org/drawingml/2006/wordprocessingDrawing" xmlns:w10="urn:schemas-microsoft-com:office:word" xmlns:w="http://schemas.openxmlformats.org/wordprocessingml/2006/main" xmlns:w14="http://schemas.microsoft.com/office/word/2010/wordml" xmlns:w15="http://schemas.microsoft.com/office/word/2012/wordml" xmlns:w16cex="http://schemas.microsoft.com/office/word/2018/wordml/cex" xmlns:w16cid="http://schemas.microsoft.com/office/word/2016/wordml/cid" xmlns:w16="http://schemas.microsoft.com/office/word/2018/wordml" xmlns:w16du="http://schemas.microsoft.com/office/word/2023/wordml/word16du" xmlns:w16sdtdh="http://schemas.microsoft.com/office/word/2020/wordml/sdtdatahash" xmlns:w16sdtfl="http://schemas.microsoft.com/office/word/2024/wordml/sdtformatlock" xmlns:w16se="http://schemas.microsoft.com/office/word/2015/wordml/symex" xmlns:wpg="http://schemas.microsoft.com/office/word/2010/wordprocessingGroup" xmlns:wpi="http://schemas.microsoft.com/office/word/2010/wordprocessingInk" xmlns:wne="http://schemas.microsoft.com/office/word/2006/wordml" xmlns:wps="http://schemas.microsoft.com/office/word/2010/wordprocessingShape" mc:Ignorable="w14 w15 w16se w16cid w16 w16cex w16sdtdh w16sdtfl w16du wp14">
+<w:footnotes xmlns:wpc="http://schemas.microsoft.com/office/word/2010/wordprocessingCanvas" xmlns:cx="http://schemas.microsoft.com/office/drawing/2014/chartex" xmlns:cx1="http://schemas.microsoft.com/office/drawing/2015/9/8/chartex" xmlns:cx2="http://schemas.microsoft.com/office/drawing/2015/10/21/chartex" xmlns:cx3="http://schemas.microsoft.com/office/drawing/2016/5/9/chartex" xmlns:cx4="http://schemas.microsoft.com/office/drawing/2016/5/10/chartex" xmlns:cx5="http://schemas.microsoft.com/office/drawing/2016/5/11/chartex" xmlns:cx6="http://schemas.microsoft.com/office/drawing/2016/5/12/chartex" xmlns:cx7="http://schemas.microsoft.com/office/drawing/2016/5/13/chartex" xmlns:cx8="http://schemas.microsoft.com/office/drawing/2016/5/14/chartex" xmlns:mc="http://schemas.openxmlformats.org/markup-compatibility/2006" xmlns:aink="http://schemas.microsoft.com/office/drawing/2016/ink" xmlns:am3d="http://schemas.microsoft.com/office/drawing/2017/model3d" xmlns:o="urn:schemas-microsoft-com:office:office" xmlns:oel="http://schemas.microsoft.com/office/2019/extlst" xmlns:r="http://schemas.openxmlformats.org/officeDocument/2006/relationships" xmlns:m="http://schemas.openxmlformats.org/officeDocument/2006/math" xmlns:v="urn:schemas-microsoft-com:vml" xmlns:wp14="http://schemas.microsoft.com/office/word/2010/wordprocessingDrawing" xmlns:wp="http://schemas.openxmlformats.org/drawingml/2006/wordprocessingDrawing" xmlns:w10="urn:schemas-microsoft-com:office:word" xmlns:w="http://schemas.openxmlformats.org/wordprocessingml/2006/main" xmlns:w14="http://schemas.microsoft.com/office/word/2010/wordml" xmlns:w15="http://schemas.microsoft.com/office/word/2012/wordml" xmlns:w16cei="http://schemas.microsoft.com/office/word/2026/wordml/cei" xmlns:w16cex="http://schemas.microsoft.com/office/word/2018/wordml/cex" xmlns:w16cid="http://schemas.microsoft.com/office/word/2016/wordml/cid" xmlns:w16="http://schemas.microsoft.com/office/word/2018/wordml" xmlns:w16du="http://schemas.microsoft.com/office/word/2023/wordml/word16du" xmlns:w16sdtdh="http://schemas.microsoft.com/office/word/2020/wordml/sdtdatahash" xmlns:w16sdtfl="http://schemas.microsoft.com/office/word/2024/wordml/sdtformatlock" xmlns:w16se="http://schemas.microsoft.com/office/word/2015/wordml/symex" xmlns:wpg="http://schemas.microsoft.com/office/word/2010/wordprocessingGroup" xmlns:wpi="http://schemas.microsoft.com/office/word/2010/wordprocessingInk" xmlns:wne="http://schemas.microsoft.com/office/word/2006/wordml" xmlns:wps="http://schemas.microsoft.com/office/word/2010/wordprocessingShape" mc:Ignorable="w14 w15 w16se w16cid w16 w16cex w16sdtdh w16sdtfl w16du wp14">
   <w:footnote w:type="separator" w:id="-1">
     <w:p>
       <w:r>
@@ -1733,7 +2005,7 @@
 </file>
 
 <file path=word/header1.xml><?xml version="1.0" encoding="utf-8"?>
-<w:hdr xmlns:wpc="http://schemas.microsoft.com/office/word/2010/wordprocessingCanvas" xmlns:cx="http://schemas.microsoft.com/office/drawing/2014/chartex" xmlns:cx1="http://schemas.microsoft.com/office/drawing/2015/9/8/chartex" xmlns:cx2="http://schemas.microsoft.com/office/drawing/2015/10/21/chartex" xmlns:cx3="http://schemas.microsoft.com/office/drawing/2016/5/9/chartex" xmlns:cx4="http://schemas.microsoft.com/office/drawing/2016/5/10/chartex" xmlns:cx5="http://schemas.microsoft.com/office/drawing/2016/5/11/chartex" xmlns:cx6="http://schemas.microsoft.com/office/drawing/2016/5/12/chartex" xmlns:cx7="http://schemas.microsoft.com/office/drawing/2016/5/13/chartex" xmlns:cx8="http://schemas.microsoft.com/office/drawing/2016/5/14/chartex" xmlns:mc="http://schemas.openxmlformats.org/markup-compatibility/2006" xmlns:aink="http://schemas.microsoft.com/office/drawing/2016/ink" xmlns:am3d="http://schemas.microsoft.com/office/drawing/2017/model3d" xmlns:o="urn:schemas-microsoft-com:office:office" xmlns:oel="http://schemas.microsoft.com/office/2019/extlst" xmlns:r="http://schemas.openxmlformats.org/officeDocument/2006/relationships" xmlns:m="http://schemas.openxmlformats.org/officeDocument/2006/math" xmlns:v="urn:schemas-microsoft-com:vml" xmlns:wp14="http://schemas.microsoft.com/office/word/2010/wordprocessingDrawing" xmlns:wp="http://schemas.openxmlformats.org/drawingml/2006/wordprocessingDrawing" xmlns:w10="urn:schemas-microsoft-com:office:word" xmlns:w="http://schemas.openxmlformats.org/wordprocessingml/2006/main" xmlns:w14="http://schemas.microsoft.com/office/word/2010/wordml" xmlns:w15="http://schemas.microsoft.com/office/word/2012/wordml" xmlns:w16cex="http://schemas.microsoft.com/office/word/2018/wordml/cex" xmlns:w16cid="http://schemas.microsoft.com/office/word/2016/wordml/cid" xmlns:w16="http://schemas.microsoft.com/office/word/2018/wordml" xmlns:w16du="http://schemas.microsoft.com/office/word/2023/wordml/word16du" xmlns:w16sdtdh="http://schemas.microsoft.com/office/word/2020/wordml/sdtdatahash" xmlns:w16sdtfl="http://schemas.microsoft.com/office/word/2024/wordml/sdtformatlock" xmlns:w16se="http://schemas.microsoft.com/office/word/2015/wordml/symex" xmlns:wpg="http://schemas.microsoft.com/office/word/2010/wordprocessingGroup" xmlns:wpi="http://schemas.microsoft.com/office/word/2010/wordprocessingInk" xmlns:wne="http://schemas.microsoft.com/office/word/2006/wordml" xmlns:wps="http://schemas.microsoft.com/office/word/2010/wordprocessingShape" mc:Ignorable="w14 w15 w16se w16cid w16 w16cex w16sdtdh w16sdtfl w16du wp14">
+<w:hdr xmlns:wpc="http://schemas.microsoft.com/office/word/2010/wordprocessingCanvas" xmlns:cx="http://schemas.microsoft.com/office/drawing/2014/chartex" xmlns:cx1="http://schemas.microsoft.com/office/drawing/2015/9/8/chartex" xmlns:cx2="http://schemas.microsoft.com/office/drawing/2015/10/21/chartex" xmlns:cx3="http://schemas.microsoft.com/office/drawing/2016/5/9/chartex" xmlns:cx4="http://schemas.microsoft.com/office/drawing/2016/5/10/chartex" xmlns:cx5="http://schemas.microsoft.com/office/drawing/2016/5/11/chartex" xmlns:cx6="http://schemas.microsoft.com/office/drawing/2016/5/12/chartex" xmlns:cx7="http://schemas.microsoft.com/office/drawing/2016/5/13/chartex" xmlns:cx8="http://schemas.microsoft.com/office/drawing/2016/5/14/chartex" xmlns:mc="http://schemas.openxmlformats.org/markup-compatibility/2006" xmlns:aink="http://schemas.microsoft.com/office/drawing/2016/ink" xmlns:am3d="http://schemas.microsoft.com/office/drawing/2017/model3d" xmlns:o="urn:schemas-microsoft-com:office:office" xmlns:oel="http://schemas.microsoft.com/office/2019/extlst" xmlns:r="http://schemas.openxmlformats.org/officeDocument/2006/relationships" xmlns:m="http://schemas.openxmlformats.org/officeDocument/2006/math" xmlns:v="urn:schemas-microsoft-com:vml" xmlns:wp14="http://schemas.microsoft.com/office/word/2010/wordprocessingDrawing" xmlns:wp="http://schemas.openxmlformats.org/drawingml/2006/wordprocessingDrawing" xmlns:w10="urn:schemas-microsoft-com:office:word" xmlns:w="http://schemas.openxmlformats.org/wordprocessingml/2006/main" xmlns:w14="http://schemas.microsoft.com/office/word/2010/wordml" xmlns:w15="http://schemas.microsoft.com/office/word/2012/wordml" xmlns:w16cei="http://schemas.microsoft.com/office/word/2026/wordml/cei" xmlns:w16cex="http://schemas.microsoft.com/office/word/2018/wordml/cex" xmlns:w16cid="http://schemas.microsoft.com/office/word/2016/wordml/cid" xmlns:w16="http://schemas.microsoft.com/office/word/2018/wordml" xmlns:w16du="http://schemas.microsoft.com/office/word/2023/wordml/word16du" xmlns:w16sdtdh="http://schemas.microsoft.com/office/word/2020/wordml/sdtdatahash" xmlns:w16sdtfl="http://schemas.microsoft.com/office/word/2024/wordml/sdtformatlock" xmlns:w16se="http://schemas.microsoft.com/office/word/2015/wordml/symex" xmlns:wpg="http://schemas.microsoft.com/office/word/2010/wordprocessingGroup" xmlns:wpi="http://schemas.microsoft.com/office/word/2010/wordprocessingInk" xmlns:wne="http://schemas.microsoft.com/office/word/2006/wordml" xmlns:wps="http://schemas.microsoft.com/office/word/2010/wordprocessingShape" mc:Ignorable="w14 w15 w16se w16cid w16 w16cex w16sdtdh w16sdtfl w16du wp14">
   <w:p>
     <w:pPr>
       <w:pStyle w:val="Encabezado"/>
@@ -1932,7 +2204,7 @@
 </file>
 
 <file path=word/numbering.xml><?xml version="1.0" encoding="utf-8"?>
-<w:numbering xmlns:wpc="http://schemas.microsoft.com/office/word/2010/wordprocessingCanvas" xmlns:cx="http://schemas.microsoft.com/office/drawing/2014/chartex" xmlns:cx1="http://schemas.microsoft.com/office/drawing/2015/9/8/chartex" xmlns:cx2="http://schemas.microsoft.com/office/drawing/2015/10/21/chartex" xmlns:cx3="http://schemas.microsoft.com/office/drawing/2016/5/9/chartex" xmlns:cx4="http://schemas.microsoft.com/office/drawing/2016/5/10/chartex" xmlns:cx5="http://schemas.microsoft.com/office/drawing/2016/5/11/chartex" xmlns:cx6="http://schemas.microsoft.com/office/drawing/2016/5/12/chartex" xmlns:cx7="http://schemas.microsoft.com/office/drawing/2016/5/13/chartex" xmlns:cx8="http://schemas.microsoft.com/office/drawing/2016/5/14/chartex" xmlns:mc="http://schemas.openxmlformats.org/markup-compatibility/2006" xmlns:aink="http://schemas.microsoft.com/office/drawing/2016/ink" xmlns:am3d="http://schemas.microsoft.com/office/drawing/2017/model3d" xmlns:o="urn:schemas-microsoft-com:office:office" xmlns:oel="http://schemas.microsoft.com/office/2019/extlst" xmlns:r="http://schemas.openxmlformats.org/officeDocument/2006/relationships" xmlns:m="http://schemas.openxmlformats.org/officeDocument/2006/math" xmlns:v="urn:schemas-microsoft-com:vml" xmlns:wp14="http://schemas.microsoft.com/office/word/2010/wordprocessingDrawing" xmlns:wp="http://schemas.openxmlformats.org/drawingml/2006/wordprocessingDrawing" xmlns:w10="urn:schemas-microsoft-com:office:word" xmlns:w="http://schemas.openxmlformats.org/wordprocessingml/2006/main" xmlns:w14="http://schemas.microsoft.com/office/word/2010/wordml" xmlns:w15="http://schemas.microsoft.com/office/word/2012/wordml" xmlns:w16cex="http://schemas.microsoft.com/office/word/2018/wordml/cex" xmlns:w16cid="http://schemas.microsoft.com/office/word/2016/wordml/cid" xmlns:w16="http://schemas.microsoft.com/office/word/2018/wordml" xmlns:w16du="http://schemas.microsoft.com/office/word/2023/wordml/word16du" xmlns:w16sdtdh="http://schemas.microsoft.com/office/word/2020/wordml/sdtdatahash" xmlns:w16sdtfl="http://schemas.microsoft.com/office/word/2024/wordml/sdtformatlock" xmlns:w16se="http://schemas.microsoft.com/office/word/2015/wordml/symex" xmlns:wpg="http://schemas.microsoft.com/office/word/2010/wordprocessingGroup" xmlns:wpi="http://schemas.microsoft.com/office/word/2010/wordprocessingInk" xmlns:wne="http://schemas.microsoft.com/office/word/2006/wordml" xmlns:wps="http://schemas.microsoft.com/office/word/2010/wordprocessingShape" mc:Ignorable="w14 w15 w16se w16cid w16 w16cex w16sdtdh w16sdtfl w16du wp14">
+<w:numbering xmlns:wpc="http://schemas.microsoft.com/office/word/2010/wordprocessingCanvas" xmlns:cx="http://schemas.microsoft.com/office/drawing/2014/chartex" xmlns:cx1="http://schemas.microsoft.com/office/drawing/2015/9/8/chartex" xmlns:cx2="http://schemas.microsoft.com/office/drawing/2015/10/21/chartex" xmlns:cx3="http://schemas.microsoft.com/office/drawing/2016/5/9/chartex" xmlns:cx4="http://schemas.microsoft.com/office/drawing/2016/5/10/chartex" xmlns:cx5="http://schemas.microsoft.com/office/drawing/2016/5/11/chartex" xmlns:cx6="http://schemas.microsoft.com/office/drawing/2016/5/12/chartex" xmlns:cx7="http://schemas.microsoft.com/office/drawing/2016/5/13/chartex" xmlns:cx8="http://schemas.microsoft.com/office/drawing/2016/5/14/chartex" xmlns:mc="http://schemas.openxmlformats.org/markup-compatibility/2006" xmlns:aink="http://schemas.microsoft.com/office/drawing/2016/ink" xmlns:am3d="http://schemas.microsoft.com/office/drawing/2017/model3d" xmlns:o="urn:schemas-microsoft-com:office:office" xmlns:oel="http://schemas.microsoft.com/office/2019/extlst" xmlns:r="http://schemas.openxmlformats.org/officeDocument/2006/relationships" xmlns:m="http://schemas.openxmlformats.org/officeDocument/2006/math" xmlns:v="urn:schemas-microsoft-com:vml" xmlns:wp14="http://schemas.microsoft.com/office/word/2010/wordprocessingDrawing" xmlns:wp="http://schemas.openxmlformats.org/drawingml/2006/wordprocessingDrawing" xmlns:w10="urn:schemas-microsoft-com:office:word" xmlns:w="http://schemas.openxmlformats.org/wordprocessingml/2006/main" xmlns:w14="http://schemas.microsoft.com/office/word/2010/wordml" xmlns:w15="http://schemas.microsoft.com/office/word/2012/wordml" xmlns:w16cei="http://schemas.microsoft.com/office/word/2026/wordml/cei" xmlns:w16cex="http://schemas.microsoft.com/office/word/2018/wordml/cex" xmlns:w16cid="http://schemas.microsoft.com/office/word/2016/wordml/cid" xmlns:w16="http://schemas.microsoft.com/office/word/2018/wordml" xmlns:w16du="http://schemas.microsoft.com/office/word/2023/wordml/word16du" xmlns:w16sdtdh="http://schemas.microsoft.com/office/word/2020/wordml/sdtdatahash" xmlns:w16sdtfl="http://schemas.microsoft.com/office/word/2024/wordml/sdtformatlock" xmlns:w16se="http://schemas.microsoft.com/office/word/2015/wordml/symex" xmlns:wpg="http://schemas.microsoft.com/office/word/2010/wordprocessingGroup" xmlns:wpi="http://schemas.microsoft.com/office/word/2010/wordprocessingInk" xmlns:wne="http://schemas.microsoft.com/office/word/2006/wordml" xmlns:wps="http://schemas.microsoft.com/office/word/2010/wordprocessingShape" mc:Ignorable="w14 w15 w16se w16cid w16 w16cex w16sdtdh w16sdtfl w16du wp14">
   <w:abstractNum w:abstractNumId="0" w15:restartNumberingAfterBreak="0">
     <w:nsid w:val="5F032F3D"/>
     <w:multiLevelType w:val="multilevel"/>
@@ -2041,17 +2313,6 @@
     <w:abstractNumId w:val="0"/>
   </w:num>
 </w:numbering>
-</file>
-
-<file path=word/people.xml><?xml version="1.0" encoding="utf-8"?>
-<w15:people xmlns:wpc="http://schemas.microsoft.com/office/word/2010/wordprocessingCanvas" xmlns:cx="http://schemas.microsoft.com/office/drawing/2014/chartex" xmlns:cx1="http://schemas.microsoft.com/office/drawing/2015/9/8/chartex" xmlns:cx2="http://schemas.microsoft.com/office/drawing/2015/10/21/chartex" xmlns:cx3="http://schemas.microsoft.com/office/drawing/2016/5/9/chartex" xmlns:cx4="http://schemas.microsoft.com/office/drawing/2016/5/10/chartex" xmlns:cx5="http://schemas.microsoft.com/office/drawing/2016/5/11/chartex" xmlns:cx6="http://schemas.microsoft.com/office/drawing/2016/5/12/chartex" xmlns:cx7="http://schemas.microsoft.com/office/drawing/2016/5/13/chartex" xmlns:cx8="http://schemas.microsoft.com/office/drawing/2016/5/14/chartex" xmlns:mc="http://schemas.openxmlformats.org/markup-compatibility/2006" xmlns:aink="http://schemas.microsoft.com/office/drawing/2016/ink" xmlns:am3d="http://schemas.microsoft.com/office/drawing/2017/model3d" xmlns:o="urn:schemas-microsoft-com:office:office" xmlns:oel="http://schemas.microsoft.com/office/2019/extlst" xmlns:r="http://schemas.openxmlformats.org/officeDocument/2006/relationships" xmlns:m="http://schemas.openxmlformats.org/officeDocument/2006/math" xmlns:v="urn:schemas-microsoft-com:vml" xmlns:wp14="http://schemas.microsoft.com/office/word/2010/wordprocessingDrawing" xmlns:wp="http://schemas.openxmlformats.org/drawingml/2006/wordprocessingDrawing" xmlns:w10="urn:schemas-microsoft-com:office:word" xmlns:w="http://schemas.openxmlformats.org/wordprocessingml/2006/main" xmlns:w14="http://schemas.microsoft.com/office/word/2010/wordml" xmlns:w15="http://schemas.microsoft.com/office/word/2012/wordml" xmlns:w16cex="http://schemas.microsoft.com/office/word/2018/wordml/cex" xmlns:w16cid="http://schemas.microsoft.com/office/word/2016/wordml/cid" xmlns:w16="http://schemas.microsoft.com/office/word/2018/wordml" xmlns:w16du="http://schemas.microsoft.com/office/word/2023/wordml/word16du" xmlns:w16sdtdh="http://schemas.microsoft.com/office/word/2020/wordml/sdtdatahash" xmlns:w16sdtfl="http://schemas.microsoft.com/office/word/2024/wordml/sdtformatlock" xmlns:w16se="http://schemas.microsoft.com/office/word/2015/wordml/symex" xmlns:wpg="http://schemas.microsoft.com/office/word/2010/wordprocessingGroup" xmlns:wpi="http://schemas.microsoft.com/office/word/2010/wordprocessingInk" xmlns:wne="http://schemas.microsoft.com/office/word/2006/wordml" xmlns:wps="http://schemas.microsoft.com/office/word/2010/wordprocessingShape" mc:Ignorable="w14 w15 w16se w16cid w16 w16cex w16sdtdh w16sdtfl w16du wp14">
-  <w15:person w15:author="Rodriguez Villagomez, Ligia Elena">
-    <w15:presenceInfo w15:providerId="AD" w15:userId="S::lerodriguez@sri.gob.ec::dce8da72-44a3-4289-b7c3-564e8c483864"/>
-  </w15:person>
-  <w15:person w15:author="Zambrano Hernandez, Maria Fernanda">
-    <w15:presenceInfo w15:providerId="AD" w15:userId="S::mfzambranoh@sri.gob.ec::aae4b608-a72c-4734-97d3-ebb40638f5e0"/>
-  </w15:person>
-</w15:people>
 </file>
 
 <file path=word/styles.xml><?xml version="1.0" encoding="utf-8"?>
@@ -3227,4 +3488,16 @@
     </a:ext>
   </a:extLst>
 </a:theme>
+</file>
+
+<file path=customXml/item1.xml><?xml version="1.0" encoding="utf-8"?>
+<b:Sources xmlns:b="http://schemas.openxmlformats.org/officeDocument/2006/bibliography" xmlns="http://schemas.openxmlformats.org/officeDocument/2006/bibliography" SelectedStyle="\APASixthEditionOfficeOnline.xsl" StyleName="APA" Version="6"/>
+</file>
+
+<file path=customXml/itemProps1.xml><?xml version="1.0" encoding="utf-8"?>
+<ds:datastoreItem xmlns:ds="http://schemas.openxmlformats.org/officeDocument/2006/customXml" ds:itemID="{23A51A75-E1BD-4EF1-ADD8-55C87B025FDB}">
+  <ds:schemaRefs>
+    <ds:schemaRef ds:uri="http://schemas.openxmlformats.org/officeDocument/2006/bibliography"/>
+  </ds:schemaRefs>
+</ds:datastoreItem>
 </file>
</xml_diff>